<commit_message>
Migrating to md in Obsidian
</commit_message>
<xml_diff>
--- a/flutter_documents/f2_navigation/f9_go_router_or_navigator_2_advanced_navigation.docx
+++ b/flutter_documents/f2_navigation/f9_go_router_or_navigator_2_advanced_navigation.docx
@@ -1047,1343 +1047,380 @@
     <w:p>
       <w:pPr>
         <w:jc w:val="both"/>
-        <w:rPr>
-          <w:b/>
-          <w:bCs/>
-        </w:rPr>
-      </w:pPr>
-      <w:r>
-        <w:rPr>
-          <w:b/>
-          <w:bCs/>
-        </w:rPr>
+      </w:pPr>
+      <w:r>
+        <w:t xml:space="preserve">                                          ┌─────────────────────────────────────────┐</w:t>
+      </w:r>
+    </w:p>
+    <w:p>
+      <w:pPr>
+        <w:jc w:val="both"/>
+      </w:pPr>
+      <w:r>
+        <w:t xml:space="preserve">                                          │                                        </w:t>
+      </w:r>
+      <w:proofErr w:type="spellStart"/>
+      <w:r>
+        <w:t>GoRouter</w:t>
+      </w:r>
+      <w:proofErr w:type="spellEnd"/>
+      <w:r>
+        <w:t xml:space="preserve">                                        │</w:t>
+      </w:r>
+    </w:p>
+    <w:p>
+      <w:pPr>
+        <w:jc w:val="both"/>
+      </w:pPr>
+      <w:r>
+        <w:t xml:space="preserve">                                          │       </w:t>
+      </w:r>
+      <w:proofErr w:type="gramStart"/>
+      <w:r>
+        <w:t xml:space="preserve">   (</w:t>
+      </w:r>
+      <w:proofErr w:type="gramEnd"/>
+      <w:r>
+        <w:t>implements all 3 Router-API pieces)          │</w:t>
+      </w:r>
+    </w:p>
+    <w:p>
+      <w:pPr>
+        <w:jc w:val="both"/>
+      </w:pPr>
+      <w:r>
+        <w:t xml:space="preserve">                                          │                                                                                                     │</w:t>
+      </w:r>
+    </w:p>
+    <w:p>
+      <w:pPr>
+        <w:jc w:val="both"/>
+      </w:pPr>
+      <w:r>
+        <w:t>OS / Browser             │                     ┌──────────────────────┐                     │</w:t>
+      </w:r>
+    </w:p>
+    <w:p>
+      <w:pPr>
+        <w:jc w:val="both"/>
+      </w:pPr>
+      <w:r>
+        <w:t>URL change   ───</w:t>
+      </w:r>
+      <w:r>
+        <w:rPr>
+          <w:rFonts w:ascii="Cambria Math" w:hAnsi="Cambria Math" w:cs="Cambria Math"/>
+        </w:rPr>
+        <w:t>▶</w:t>
+      </w:r>
+      <w:r>
+        <w:t xml:space="preserve"> </w:t>
+      </w:r>
+      <w:r>
+        <w:rPr>
+          <w:rFonts w:ascii="Aptos" w:hAnsi="Aptos" w:cs="Aptos"/>
+        </w:rPr>
+        <w:t>│</w:t>
+      </w:r>
+      <w:r>
+        <w:t xml:space="preserve">                     </w:t>
+      </w:r>
+      <w:r>
+        <w:rPr>
+          <w:rFonts w:ascii="Aptos" w:hAnsi="Aptos" w:cs="Aptos"/>
+        </w:rPr>
+        <w:t>│</w:t>
+      </w:r>
+      <w:r>
+        <w:t xml:space="preserve"> </w:t>
+      </w:r>
+      <w:proofErr w:type="spellStart"/>
+      <w:r>
+        <w:t>RouteInformationParser</w:t>
+      </w:r>
+      <w:proofErr w:type="spellEnd"/>
+      <w:r>
+        <w:rPr>
+          <w:rFonts w:ascii="Aptos" w:hAnsi="Aptos" w:cs="Aptos"/>
+        </w:rPr>
+        <w:t>│</w:t>
+      </w:r>
+      <w:r>
         <w:t xml:space="preserve">                    </w:t>
       </w:r>
       <w:r>
         <w:rPr>
-          <w:b/>
-          <w:bCs/>
-        </w:rPr>
-        <w:t xml:space="preserve">                      </w:t>
-      </w:r>
-      <w:r>
-        <w:rPr>
-          <w:b/>
-          <w:bCs/>
-        </w:rPr>
-        <w:t>┌─────────────────────────────────────────┐</w:t>
-      </w:r>
-    </w:p>
-    <w:p>
-      <w:pPr>
-        <w:jc w:val="both"/>
-        <w:rPr>
-          <w:b/>
-          <w:bCs/>
-        </w:rPr>
-      </w:pPr>
-      <w:r>
-        <w:rPr>
-          <w:b/>
-          <w:bCs/>
-        </w:rPr>
+          <w:rFonts w:ascii="Aptos" w:hAnsi="Aptos" w:cs="Aptos"/>
+        </w:rPr>
+        <w:t>│</w:t>
+      </w:r>
+    </w:p>
+    <w:p>
+      <w:pPr>
+        <w:jc w:val="both"/>
+      </w:pPr>
+      <w:r>
+        <w:t xml:space="preserve">or </w:t>
+      </w:r>
+      <w:proofErr w:type="spellStart"/>
+      <w:proofErr w:type="gramStart"/>
+      <w:r>
+        <w:t>context.go</w:t>
+      </w:r>
+      <w:proofErr w:type="spellEnd"/>
+      <w:proofErr w:type="gramEnd"/>
+      <w:r>
+        <w:t>()          │                     └──────────</w:t>
+      </w:r>
+      <w:r>
+        <w:rPr>
+          <w:rFonts w:ascii="Arial" w:hAnsi="Arial" w:cs="Arial"/>
+        </w:rPr>
+        <w:t>┬</w:t>
+      </w:r>
+      <w:r>
+        <w:rPr>
+          <w:rFonts w:ascii="Aptos" w:hAnsi="Aptos" w:cs="Aptos"/>
+        </w:rPr>
+        <w:t>───────────┘</w:t>
+      </w:r>
+      <w:r>
         <w:t xml:space="preserve">                   </w:t>
       </w:r>
       <w:r>
         <w:rPr>
-          <w:b/>
-          <w:bCs/>
-        </w:rPr>
-        <w:t xml:space="preserve">                      </w:t>
-      </w:r>
-      <w:r>
-        <w:rPr>
-          <w:b/>
-          <w:bCs/>
-        </w:rPr>
-        <w:t xml:space="preserve"> │              </w:t>
-      </w:r>
-      <w:r>
-        <w:rPr>
-          <w:b/>
-          <w:bCs/>
-        </w:rPr>
-        <w:t xml:space="preserve">                          </w:t>
-      </w:r>
-      <w:proofErr w:type="spellStart"/>
-      <w:r>
-        <w:rPr>
-          <w:b/>
-          <w:bCs/>
-        </w:rPr>
-        <w:t>GoRouter</w:t>
-      </w:r>
-      <w:proofErr w:type="spellEnd"/>
-      <w:r>
-        <w:rPr>
-          <w:b/>
-          <w:bCs/>
-        </w:rPr>
-        <w:t xml:space="preserve">      </w:t>
-      </w:r>
-      <w:r>
-        <w:rPr>
-          <w:b/>
-          <w:bCs/>
-        </w:rPr>
-        <w:t xml:space="preserve"> </w:t>
-      </w:r>
-      <w:r>
-        <w:rPr>
-          <w:b/>
-          <w:bCs/>
-        </w:rPr>
-        <w:t xml:space="preserve">           </w:t>
-      </w:r>
-      <w:r>
-        <w:rPr>
-          <w:b/>
-          <w:bCs/>
-        </w:rPr>
-        <w:t xml:space="preserve">                  </w:t>
-      </w:r>
-      <w:r>
-        <w:rPr>
-          <w:b/>
-          <w:bCs/>
-        </w:rPr>
-        <w:t xml:space="preserve">    │</w:t>
-      </w:r>
-    </w:p>
-    <w:p>
-      <w:pPr>
-        <w:jc w:val="both"/>
-        <w:rPr>
-          <w:b/>
-          <w:bCs/>
-        </w:rPr>
-      </w:pPr>
-      <w:r>
-        <w:rPr>
-          <w:b/>
-          <w:bCs/>
-        </w:rPr>
-        <w:t xml:space="preserve">                </w:t>
-      </w:r>
-      <w:r>
-        <w:rPr>
-          <w:b/>
-          <w:bCs/>
-        </w:rPr>
-        <w:t xml:space="preserve">                      </w:t>
-      </w:r>
-      <w:r>
-        <w:rPr>
-          <w:b/>
-          <w:bCs/>
-        </w:rPr>
-        <w:t xml:space="preserve">   </w:t>
-      </w:r>
-      <w:r>
-        <w:rPr>
-          <w:b/>
-          <w:bCs/>
-        </w:rPr>
-        <w:t xml:space="preserve"> </w:t>
-      </w:r>
-      <w:r>
-        <w:rPr>
-          <w:b/>
-          <w:bCs/>
+          <w:rFonts w:ascii="Aptos" w:hAnsi="Aptos" w:cs="Aptos"/>
         </w:rPr>
         <w:t>│</w:t>
       </w:r>
-      <w:r>
-        <w:rPr>
-          <w:b/>
-          <w:bCs/>
-        </w:rPr>
-        <w:t xml:space="preserve">       </w:t>
+    </w:p>
+    <w:p>
+      <w:pPr>
+        <w:jc w:val="both"/>
+      </w:pPr>
+      <w:r>
+        <w:t xml:space="preserve">                                          │                                                </w:t>
+      </w:r>
+      <w:r>
+        <w:rPr>
+          <w:rFonts w:ascii="Arial" w:hAnsi="Arial" w:cs="Arial"/>
+        </w:rPr>
+        <w:t>▼</w:t>
+      </w:r>
+      <w:r>
+        <w:t xml:space="preserve">                                                </w:t>
+      </w:r>
+      <w:r>
+        <w:rPr>
+          <w:rFonts w:ascii="Aptos" w:hAnsi="Aptos" w:cs="Aptos"/>
+        </w:rPr>
+        <w:t>│</w:t>
+      </w:r>
+    </w:p>
+    <w:p>
+      <w:pPr>
+        <w:jc w:val="both"/>
+      </w:pPr>
+      <w:r>
+        <w:t xml:space="preserve">                                          │                              matches against your                       │</w:t>
+      </w:r>
+    </w:p>
+    <w:p>
+      <w:pPr>
+        <w:jc w:val="both"/>
+      </w:pPr>
+      <w:r>
+        <w:t xml:space="preserve">                                          │                              routes: [</w:t>
+      </w:r>
+      <w:proofErr w:type="spellStart"/>
+      <w:r>
+        <w:t>GoRoute</w:t>
+      </w:r>
+      <w:proofErr w:type="spellEnd"/>
+      <w:r>
+        <w:t xml:space="preserve">, </w:t>
+      </w:r>
+      <w:proofErr w:type="spellStart"/>
+      <w:r>
+        <w:t>GoRoute</w:t>
+      </w:r>
+      <w:proofErr w:type="spellEnd"/>
+      <w:r>
+        <w:t>, ...]  │</w:t>
+      </w:r>
+    </w:p>
+    <w:p>
+      <w:pPr>
+        <w:jc w:val="both"/>
+      </w:pPr>
+      <w:r>
+        <w:t xml:space="preserve">                                          │                                                │                                                  │</w:t>
+      </w:r>
+    </w:p>
+    <w:p>
+      <w:pPr>
+        <w:jc w:val="both"/>
+      </w:pPr>
+      <w:r>
+        <w:t xml:space="preserve">                                          │                                               </w:t>
+      </w:r>
+      <w:r>
+        <w:rPr>
+          <w:rFonts w:ascii="Arial" w:hAnsi="Arial" w:cs="Arial"/>
+        </w:rPr>
+        <w:t xml:space="preserve">▼   </w:t>
+      </w:r>
+      <w:r>
+        <w:t xml:space="preserve">                                             </w:t>
+      </w:r>
+      <w:r>
+        <w:rPr>
+          <w:rFonts w:ascii="Aptos" w:hAnsi="Aptos" w:cs="Aptos"/>
+        </w:rPr>
+        <w:t>│</w:t>
+      </w:r>
+    </w:p>
+    <w:p>
+      <w:pPr>
+        <w:jc w:val="both"/>
+      </w:pPr>
+      <w:r>
+        <w:t xml:space="preserve">                                          │                      ┌──────────────────────┐                    │</w:t>
+      </w:r>
+    </w:p>
+    <w:p>
+      <w:pPr>
+        <w:jc w:val="both"/>
+      </w:pPr>
+      <w:r>
+        <w:t xml:space="preserve">                                          │                      │           RouterDelegate        │                    │</w:t>
+      </w:r>
+    </w:p>
+    <w:p>
+      <w:pPr>
+        <w:jc w:val="both"/>
+      </w:pPr>
+      <w:r>
+        <w:t xml:space="preserve">                                          │                      └──────────</w:t>
+      </w:r>
+      <w:r>
+        <w:rPr>
+          <w:rFonts w:ascii="Arial" w:hAnsi="Arial" w:cs="Arial"/>
+        </w:rPr>
+        <w:t>┬</w:t>
+      </w:r>
+      <w:r>
+        <w:rPr>
+          <w:rFonts w:ascii="Aptos" w:hAnsi="Aptos" w:cs="Aptos"/>
+        </w:rPr>
+        <w:t>───────────┘</w:t>
+      </w:r>
+      <w:r>
+        <w:t xml:space="preserve">                   </w:t>
+      </w:r>
+      <w:r>
+        <w:rPr>
+          <w:rFonts w:ascii="Aptos" w:hAnsi="Aptos" w:cs="Aptos"/>
+        </w:rPr>
+        <w:t>│</w:t>
+      </w:r>
+    </w:p>
+    <w:p>
+      <w:pPr>
+        <w:jc w:val="both"/>
+      </w:pPr>
+      <w:r>
+        <w:t xml:space="preserve">                                          └──</w:t>
+      </w:r>
+      <w:r>
+        <w:rPr>
+          <w:rFonts w:ascii="Aptos" w:hAnsi="Aptos" w:cs="Aptos"/>
+        </w:rPr>
+        <w:t>───────</w:t>
+      </w:r>
+      <w:r>
+        <w:t>───────────</w:t>
+      </w:r>
+      <w:r>
+        <w:rPr>
+          <w:rFonts w:ascii="Arial" w:hAnsi="Arial" w:cs="Arial"/>
+        </w:rPr>
+        <w:t>┼</w:t>
+      </w:r>
+      <w:r>
+        <w:rPr>
+          <w:rFonts w:ascii="Aptos" w:hAnsi="Aptos" w:cs="Aptos"/>
+        </w:rPr>
+        <w:t>────────────────────┘</w:t>
+      </w:r>
+    </w:p>
+    <w:p>
+      <w:pPr>
+        <w:jc w:val="both"/>
+      </w:pPr>
+      <w:r>
+        <w:t xml:space="preserve">                                                                                             </w:t>
+      </w:r>
+      <w:r>
+        <w:rPr>
+          <w:rFonts w:ascii="Arial" w:hAnsi="Arial" w:cs="Arial"/>
+        </w:rPr>
+        <w:t>▼</w:t>
+      </w:r>
+    </w:p>
+    <w:p>
+      <w:pPr>
+        <w:jc w:val="both"/>
+      </w:pPr>
+      <w:r>
+        <w:t xml:space="preserve">                                                 </w:t>
       </w:r>
       <w:proofErr w:type="gramStart"/>
       <w:r>
-        <w:rPr>
-          <w:b/>
-          <w:bCs/>
-        </w:rPr>
-        <w:t xml:space="preserve"> </w:t>
-      </w:r>
-      <w:r>
-        <w:rPr>
-          <w:b/>
-          <w:bCs/>
-        </w:rPr>
-        <w:t xml:space="preserve">  (</w:t>
+        <w:t>Navigator(</w:t>
       </w:r>
       <w:proofErr w:type="gramEnd"/>
       <w:r>
-        <w:rPr>
-          <w:b/>
-          <w:bCs/>
-        </w:rPr>
-        <w:t xml:space="preserve">implements all 3 Router-API pieces)     </w:t>
-      </w:r>
-      <w:r>
-        <w:rPr>
-          <w:b/>
-          <w:bCs/>
-        </w:rPr>
-        <w:t xml:space="preserve">     </w:t>
-      </w:r>
-      <w:r>
-        <w:rPr>
-          <w:b/>
-          <w:bCs/>
-        </w:rPr>
-        <w:t>│</w:t>
-      </w:r>
-    </w:p>
-    <w:p>
-      <w:pPr>
-        <w:jc w:val="both"/>
-        <w:rPr>
-          <w:b/>
-          <w:bCs/>
-        </w:rPr>
-      </w:pPr>
-      <w:r>
-        <w:rPr>
-          <w:b/>
-          <w:bCs/>
-        </w:rPr>
-        <w:t xml:space="preserve">                   </w:t>
-      </w:r>
-      <w:r>
-        <w:rPr>
-          <w:b/>
-          <w:bCs/>
-        </w:rPr>
-        <w:t xml:space="preserve">                       </w:t>
-      </w:r>
-      <w:r>
-        <w:rPr>
-          <w:b/>
-          <w:bCs/>
-        </w:rPr>
-        <w:t xml:space="preserve">│                                        </w:t>
-      </w:r>
-      <w:r>
-        <w:rPr>
-          <w:b/>
-          <w:bCs/>
-        </w:rPr>
-        <w:t xml:space="preserve">    </w:t>
-      </w:r>
-      <w:r>
-        <w:rPr>
-          <w:b/>
-          <w:bCs/>
-        </w:rPr>
-        <w:t xml:space="preserve">    </w:t>
-      </w:r>
-      <w:r>
-        <w:rPr>
-          <w:b/>
-          <w:bCs/>
-        </w:rPr>
-        <w:t xml:space="preserve">                                                     </w:t>
-      </w:r>
-      <w:r>
-        <w:rPr>
-          <w:b/>
-          <w:bCs/>
-        </w:rPr>
-        <w:t>│</w:t>
-      </w:r>
-    </w:p>
-    <w:p>
-      <w:pPr>
-        <w:jc w:val="both"/>
-        <w:rPr>
-          <w:b/>
-          <w:bCs/>
-        </w:rPr>
-      </w:pPr>
-      <w:r>
-        <w:rPr>
-          <w:b/>
-          <w:bCs/>
-        </w:rPr>
-        <w:t xml:space="preserve">OS / Browser      </w:t>
-      </w:r>
-      <w:r>
-        <w:rPr>
-          <w:b/>
-          <w:bCs/>
-        </w:rPr>
-        <w:t xml:space="preserve">       </w:t>
-      </w:r>
-      <w:r>
-        <w:rPr>
-          <w:b/>
-          <w:bCs/>
-        </w:rPr>
-        <w:t xml:space="preserve">│  </w:t>
-      </w:r>
-      <w:r>
-        <w:rPr>
-          <w:b/>
-          <w:bCs/>
-        </w:rPr>
-        <w:t xml:space="preserve">                   </w:t>
-      </w:r>
-      <w:r>
-        <w:rPr>
-          <w:b/>
-          <w:bCs/>
-        </w:rPr>
-        <w:t xml:space="preserve">┌──────────────────────┐                 </w:t>
-      </w:r>
-      <w:r>
-        <w:rPr>
-          <w:b/>
-          <w:bCs/>
-        </w:rPr>
-        <w:t xml:space="preserve">    </w:t>
-      </w:r>
-      <w:r>
-        <w:rPr>
-          <w:b/>
-          <w:bCs/>
-        </w:rPr>
-        <w:t>│</w:t>
-      </w:r>
-    </w:p>
-    <w:p>
-      <w:pPr>
-        <w:jc w:val="both"/>
-        <w:rPr>
-          <w:b/>
-          <w:bCs/>
-        </w:rPr>
-      </w:pPr>
-      <w:r>
-        <w:rPr>
-          <w:b/>
-          <w:bCs/>
-        </w:rPr>
-        <w:t>URL change   ───</w:t>
-      </w:r>
-      <w:r>
-        <w:rPr>
-          <w:rFonts w:ascii="Cambria Math" w:hAnsi="Cambria Math" w:cs="Cambria Math"/>
-          <w:b/>
-          <w:bCs/>
-        </w:rPr>
-        <w:t>▶</w:t>
-      </w:r>
-      <w:r>
-        <w:rPr>
-          <w:b/>
-          <w:bCs/>
-        </w:rPr>
-        <w:t xml:space="preserve"> </w:t>
-      </w:r>
-      <w:r>
-        <w:rPr>
-          <w:rFonts w:ascii="Aptos" w:hAnsi="Aptos" w:cs="Aptos"/>
-          <w:b/>
-          <w:bCs/>
-        </w:rPr>
-        <w:t>│</w:t>
-      </w:r>
-      <w:r>
-        <w:rPr>
-          <w:b/>
-          <w:bCs/>
-        </w:rPr>
-        <w:t xml:space="preserve"> </w:t>
-      </w:r>
-      <w:r>
-        <w:rPr>
-          <w:b/>
-          <w:bCs/>
-        </w:rPr>
-        <w:t xml:space="preserve">                   </w:t>
-      </w:r>
-      <w:r>
-        <w:rPr>
-          <w:b/>
-          <w:bCs/>
-        </w:rPr>
-        <w:t xml:space="preserve"> </w:t>
-      </w:r>
-      <w:r>
-        <w:rPr>
-          <w:rFonts w:ascii="Aptos" w:hAnsi="Aptos" w:cs="Aptos"/>
-          <w:b/>
-          <w:bCs/>
-        </w:rPr>
-        <w:t>│</w:t>
-      </w:r>
-      <w:r>
-        <w:rPr>
-          <w:b/>
-          <w:bCs/>
-        </w:rPr>
-        <w:t xml:space="preserve"> </w:t>
-      </w:r>
-      <w:proofErr w:type="spellStart"/>
-      <w:r>
-        <w:rPr>
-          <w:b/>
-          <w:bCs/>
-        </w:rPr>
-        <w:t>RouteInformationParser</w:t>
-      </w:r>
-      <w:proofErr w:type="spellEnd"/>
-      <w:r>
-        <w:rPr>
-          <w:rFonts w:ascii="Aptos" w:hAnsi="Aptos" w:cs="Aptos"/>
-          <w:b/>
-          <w:bCs/>
-        </w:rPr>
-        <w:t>│</w:t>
-      </w:r>
-      <w:r>
-        <w:rPr>
-          <w:b/>
-          <w:bCs/>
-        </w:rPr>
-        <w:t xml:space="preserve">                 </w:t>
-      </w:r>
-      <w:r>
-        <w:rPr>
-          <w:b/>
-          <w:bCs/>
-        </w:rPr>
-        <w:t xml:space="preserve">   </w:t>
-      </w:r>
-      <w:r>
-        <w:rPr>
-          <w:rFonts w:ascii="Aptos" w:hAnsi="Aptos" w:cs="Aptos"/>
-          <w:b/>
-          <w:bCs/>
-        </w:rPr>
-        <w:t>│</w:t>
-      </w:r>
-    </w:p>
-    <w:p>
-      <w:pPr>
-        <w:jc w:val="both"/>
-        <w:rPr>
-          <w:b/>
-          <w:bCs/>
-        </w:rPr>
-      </w:pPr>
-      <w:r>
-        <w:rPr>
-          <w:b/>
-          <w:bCs/>
-        </w:rPr>
-        <w:t xml:space="preserve">or </w:t>
-      </w:r>
-      <w:proofErr w:type="spellStart"/>
-      <w:proofErr w:type="gramStart"/>
-      <w:r>
-        <w:rPr>
-          <w:b/>
-          <w:bCs/>
-        </w:rPr>
-        <w:t>context.go</w:t>
-      </w:r>
-      <w:proofErr w:type="spellEnd"/>
-      <w:proofErr w:type="gramEnd"/>
-      <w:r>
-        <w:rPr>
-          <w:b/>
-          <w:bCs/>
-        </w:rPr>
-        <w:t xml:space="preserve">()   </w:t>
-      </w:r>
-      <w:r>
-        <w:rPr>
-          <w:b/>
-          <w:bCs/>
-        </w:rPr>
-        <w:t xml:space="preserve">       </w:t>
-      </w:r>
-      <w:r>
-        <w:rPr>
-          <w:b/>
-          <w:bCs/>
-        </w:rPr>
-        <w:t xml:space="preserve">│  </w:t>
-      </w:r>
-      <w:r>
-        <w:rPr>
-          <w:b/>
-          <w:bCs/>
-        </w:rPr>
-        <w:t xml:space="preserve">                   </w:t>
-      </w:r>
-      <w:r>
-        <w:rPr>
-          <w:b/>
-          <w:bCs/>
-        </w:rPr>
-        <w:t>└──────────</w:t>
+        <w:t>pages: [</w:t>
+      </w:r>
+      <w:proofErr w:type="spellStart"/>
+      <w:r>
+        <w:t>HomePage</w:t>
+      </w:r>
+      <w:proofErr w:type="spellEnd"/>
+      <w:r>
+        <w:t>, DetailsPage])</w:t>
+      </w:r>
+    </w:p>
+    <w:p>
+      <w:pPr>
+        <w:jc w:val="both"/>
+      </w:pPr>
+      <w:r>
+        <w:lastRenderedPageBreak/>
+        <w:t xml:space="preserve">                                                                                              │</w:t>
+      </w:r>
+    </w:p>
+    <w:p>
+      <w:pPr>
+        <w:jc w:val="both"/>
+      </w:pPr>
+      <w:r>
+        <w:t xml:space="preserve">                                                                                             </w:t>
       </w:r>
       <w:r>
         <w:rPr>
           <w:rFonts w:ascii="Arial" w:hAnsi="Arial" w:cs="Arial"/>
-          <w:b/>
-          <w:bCs/>
-        </w:rPr>
-        <w:t>┬</w:t>
-      </w:r>
-      <w:r>
-        <w:rPr>
-          <w:rFonts w:ascii="Aptos" w:hAnsi="Aptos" w:cs="Aptos"/>
-          <w:b/>
-          <w:bCs/>
-        </w:rPr>
-        <w:t>───────────┘</w:t>
-      </w:r>
-      <w:r>
-        <w:rPr>
-          <w:b/>
-          <w:bCs/>
-        </w:rPr>
-        <w:t xml:space="preserve">                 </w:t>
-      </w:r>
-      <w:r>
-        <w:rPr>
-          <w:b/>
-          <w:bCs/>
-        </w:rPr>
-        <w:t xml:space="preserve">  </w:t>
-      </w:r>
-      <w:r>
-        <w:rPr>
-          <w:rFonts w:ascii="Aptos" w:hAnsi="Aptos" w:cs="Aptos"/>
-          <w:b/>
-          <w:bCs/>
-        </w:rPr>
-        <w:t>│</w:t>
-      </w:r>
-    </w:p>
-    <w:p>
-      <w:pPr>
-        <w:jc w:val="both"/>
-        <w:rPr>
-          <w:b/>
-          <w:bCs/>
-        </w:rPr>
-      </w:pPr>
-      <w:r>
-        <w:rPr>
-          <w:b/>
-          <w:bCs/>
-        </w:rPr>
-        <w:t xml:space="preserve">                    </w:t>
-      </w:r>
-      <w:r>
-        <w:rPr>
-          <w:b/>
-          <w:bCs/>
-        </w:rPr>
-        <w:t xml:space="preserve">                      </w:t>
-      </w:r>
-      <w:r>
-        <w:rPr>
-          <w:b/>
-          <w:bCs/>
-        </w:rPr>
-        <w:t xml:space="preserve">│            </w:t>
-      </w:r>
-      <w:r>
-        <w:rPr>
-          <w:b/>
-          <w:bCs/>
-        </w:rPr>
-        <w:t xml:space="preserve">                                   </w:t>
-      </w:r>
-      <w:r>
-        <w:rPr>
-          <w:b/>
-          <w:bCs/>
-        </w:rPr>
-        <w:t xml:space="preserve"> </w:t>
-      </w:r>
-      <w:r>
-        <w:rPr>
-          <w:rFonts w:ascii="Arial" w:hAnsi="Arial" w:cs="Arial"/>
-          <w:b/>
-          <w:bCs/>
         </w:rPr>
         <w:t>▼</w:t>
       </w:r>
-      <w:r>
-        <w:rPr>
-          <w:b/>
-          <w:bCs/>
-        </w:rPr>
-        <w:t xml:space="preserve">                              </w:t>
-      </w:r>
-      <w:r>
-        <w:rPr>
-          <w:b/>
-          <w:bCs/>
-        </w:rPr>
-        <w:t xml:space="preserve">                  </w:t>
-      </w:r>
-      <w:r>
-        <w:rPr>
-          <w:rFonts w:ascii="Aptos" w:hAnsi="Aptos" w:cs="Aptos"/>
-          <w:b/>
-          <w:bCs/>
-        </w:rPr>
-        <w:t>│</w:t>
-      </w:r>
-    </w:p>
-    <w:p>
-      <w:pPr>
-        <w:jc w:val="both"/>
-        <w:rPr>
-          <w:b/>
-          <w:bCs/>
-        </w:rPr>
-      </w:pPr>
-      <w:r>
-        <w:rPr>
-          <w:b/>
-          <w:bCs/>
-        </w:rPr>
-        <w:t xml:space="preserve">                   </w:t>
-      </w:r>
-      <w:r>
-        <w:rPr>
-          <w:b/>
-          <w:bCs/>
-        </w:rPr>
-        <w:t xml:space="preserve">                      </w:t>
-      </w:r>
-      <w:r>
-        <w:rPr>
-          <w:b/>
-          <w:bCs/>
-        </w:rPr>
-        <w:t xml:space="preserve"> │     </w:t>
-      </w:r>
-      <w:r>
-        <w:rPr>
-          <w:b/>
-          <w:bCs/>
-        </w:rPr>
-        <w:t xml:space="preserve">                         </w:t>
-      </w:r>
-      <w:r>
-        <w:rPr>
-          <w:b/>
-          <w:bCs/>
-        </w:rPr>
-        <w:t xml:space="preserve">matches against your                </w:t>
-      </w:r>
-      <w:r>
-        <w:rPr>
-          <w:b/>
-          <w:bCs/>
-        </w:rPr>
-        <w:t xml:space="preserve">     </w:t>
-      </w:r>
-      <w:r>
-        <w:rPr>
-          <w:b/>
-          <w:bCs/>
-        </w:rPr>
-        <w:t xml:space="preserve">  │</w:t>
-      </w:r>
-    </w:p>
-    <w:p>
-      <w:pPr>
-        <w:jc w:val="both"/>
-        <w:rPr>
-          <w:b/>
-          <w:bCs/>
-        </w:rPr>
-      </w:pPr>
-      <w:r>
-        <w:rPr>
-          <w:b/>
-          <w:bCs/>
-        </w:rPr>
-        <w:t xml:space="preserve">                    </w:t>
-      </w:r>
-      <w:r>
-        <w:rPr>
-          <w:b/>
-          <w:bCs/>
-        </w:rPr>
-        <w:t xml:space="preserve">                      </w:t>
-      </w:r>
-      <w:r>
-        <w:rPr>
-          <w:b/>
-          <w:bCs/>
-        </w:rPr>
-        <w:t xml:space="preserve">│      </w:t>
-      </w:r>
-      <w:r>
-        <w:rPr>
-          <w:b/>
-          <w:bCs/>
-        </w:rPr>
-        <w:t xml:space="preserve">                        </w:t>
-      </w:r>
-      <w:r>
-        <w:rPr>
-          <w:b/>
-          <w:bCs/>
-        </w:rPr>
-        <w:t>routes: [</w:t>
-      </w:r>
-      <w:proofErr w:type="spellStart"/>
-      <w:r>
-        <w:rPr>
-          <w:b/>
-          <w:bCs/>
-        </w:rPr>
-        <w:t>GoRoute</w:t>
-      </w:r>
-      <w:proofErr w:type="spellEnd"/>
-      <w:r>
-        <w:rPr>
-          <w:b/>
-          <w:bCs/>
-        </w:rPr>
-        <w:t xml:space="preserve">, </w:t>
-      </w:r>
-      <w:proofErr w:type="spellStart"/>
-      <w:r>
-        <w:rPr>
-          <w:b/>
-          <w:bCs/>
-        </w:rPr>
-        <w:t>GoRoute</w:t>
-      </w:r>
-      <w:proofErr w:type="spellEnd"/>
-      <w:r>
-        <w:rPr>
-          <w:b/>
-          <w:bCs/>
-        </w:rPr>
-        <w:t>, ...]  │</w:t>
-      </w:r>
-    </w:p>
-    <w:p>
-      <w:pPr>
-        <w:jc w:val="both"/>
-        <w:rPr>
-          <w:b/>
-          <w:bCs/>
-        </w:rPr>
-      </w:pPr>
-      <w:r>
-        <w:rPr>
-          <w:b/>
-          <w:bCs/>
-        </w:rPr>
-        <w:t xml:space="preserve">                   </w:t>
-      </w:r>
-      <w:r>
-        <w:rPr>
-          <w:b/>
-          <w:bCs/>
-        </w:rPr>
-        <w:t xml:space="preserve">                      </w:t>
-      </w:r>
-      <w:r>
-        <w:rPr>
-          <w:b/>
-          <w:bCs/>
-        </w:rPr>
-        <w:t xml:space="preserve"> │           </w:t>
-      </w:r>
-      <w:r>
-        <w:rPr>
-          <w:b/>
-          <w:bCs/>
-        </w:rPr>
-        <w:t xml:space="preserve">                                   </w:t>
-      </w:r>
-      <w:r>
-        <w:rPr>
-          <w:b/>
-          <w:bCs/>
-        </w:rPr>
-        <w:t xml:space="preserve">  │                            </w:t>
-      </w:r>
-      <w:r>
-        <w:rPr>
-          <w:b/>
-          <w:bCs/>
-        </w:rPr>
-        <w:t xml:space="preserve">                     </w:t>
-      </w:r>
-      <w:r>
-        <w:rPr>
-          <w:b/>
-          <w:bCs/>
-        </w:rPr>
-        <w:t xml:space="preserve"> │</w:t>
-      </w:r>
-    </w:p>
-    <w:p>
-      <w:pPr>
-        <w:jc w:val="both"/>
-        <w:rPr>
-          <w:b/>
-          <w:bCs/>
-        </w:rPr>
-      </w:pPr>
-      <w:r>
-        <w:rPr>
-          <w:b/>
-          <w:bCs/>
-        </w:rPr>
-        <w:t xml:space="preserve">                  </w:t>
-      </w:r>
-      <w:r>
-        <w:rPr>
-          <w:b/>
-          <w:bCs/>
-        </w:rPr>
-        <w:t xml:space="preserve">                      </w:t>
-      </w:r>
-      <w:r>
-        <w:rPr>
-          <w:b/>
-          <w:bCs/>
-        </w:rPr>
-        <w:t xml:space="preserve">  │             </w:t>
-      </w:r>
-      <w:r>
-        <w:rPr>
-          <w:b/>
-          <w:bCs/>
-        </w:rPr>
-        <w:t xml:space="preserve">                                  </w:t>
-      </w:r>
-      <w:r>
-        <w:rPr>
-          <w:rFonts w:ascii="Arial" w:hAnsi="Arial" w:cs="Arial"/>
-          <w:b/>
-          <w:bCs/>
-        </w:rPr>
-        <w:t>▼</w:t>
-      </w:r>
-      <w:r>
-        <w:rPr>
-          <w:rFonts w:ascii="Arial" w:hAnsi="Arial" w:cs="Arial"/>
-          <w:b/>
-          <w:bCs/>
-        </w:rPr>
-        <w:t xml:space="preserve">   </w:t>
-      </w:r>
-      <w:r>
-        <w:rPr>
-          <w:b/>
-          <w:bCs/>
-        </w:rPr>
-        <w:t xml:space="preserve">                             </w:t>
-      </w:r>
-      <w:r>
-        <w:rPr>
-          <w:b/>
-          <w:bCs/>
-        </w:rPr>
-        <w:t xml:space="preserve">               </w:t>
-      </w:r>
-      <w:r>
-        <w:rPr>
-          <w:b/>
-          <w:bCs/>
-        </w:rPr>
-        <w:t xml:space="preserve"> </w:t>
-      </w:r>
-      <w:r>
-        <w:rPr>
-          <w:rFonts w:ascii="Aptos" w:hAnsi="Aptos" w:cs="Aptos"/>
-          <w:b/>
-          <w:bCs/>
-        </w:rPr>
-        <w:t>│</w:t>
-      </w:r>
-    </w:p>
-    <w:p>
-      <w:pPr>
-        <w:jc w:val="both"/>
-        <w:rPr>
-          <w:b/>
-          <w:bCs/>
-        </w:rPr>
-      </w:pPr>
-      <w:r>
-        <w:rPr>
-          <w:b/>
-          <w:bCs/>
-        </w:rPr>
-        <w:t xml:space="preserve">                    </w:t>
-      </w:r>
-      <w:r>
-        <w:rPr>
-          <w:b/>
-          <w:bCs/>
-        </w:rPr>
-        <w:t xml:space="preserve">                      </w:t>
-      </w:r>
-      <w:r>
-        <w:rPr>
-          <w:b/>
-          <w:bCs/>
-        </w:rPr>
-        <w:t xml:space="preserve">│  </w:t>
-      </w:r>
-      <w:r>
-        <w:rPr>
-          <w:b/>
-          <w:bCs/>
-        </w:rPr>
-        <w:t xml:space="preserve">                    </w:t>
-      </w:r>
-      <w:r>
-        <w:rPr>
-          <w:b/>
-          <w:bCs/>
-        </w:rPr>
-        <w:t xml:space="preserve">┌──────────────────────┐         </w:t>
-      </w:r>
-      <w:r>
-        <w:rPr>
-          <w:b/>
-          <w:bCs/>
-        </w:rPr>
-        <w:t xml:space="preserve">           </w:t>
-      </w:r>
-      <w:r>
-        <w:rPr>
-          <w:b/>
-          <w:bCs/>
-        </w:rPr>
-        <w:t>│</w:t>
-      </w:r>
-    </w:p>
-    <w:p>
-      <w:pPr>
-        <w:jc w:val="both"/>
-        <w:rPr>
-          <w:b/>
-          <w:bCs/>
-        </w:rPr>
-      </w:pPr>
-      <w:r>
-        <w:rPr>
-          <w:b/>
-          <w:bCs/>
-        </w:rPr>
-        <w:t xml:space="preserve">                   </w:t>
-      </w:r>
-      <w:r>
-        <w:rPr>
-          <w:b/>
-          <w:bCs/>
-        </w:rPr>
-        <w:t xml:space="preserve">                      </w:t>
-      </w:r>
-      <w:r>
-        <w:rPr>
-          <w:b/>
-          <w:bCs/>
-        </w:rPr>
-        <w:t xml:space="preserve"> │  </w:t>
-      </w:r>
-      <w:r>
-        <w:rPr>
-          <w:b/>
-          <w:bCs/>
-        </w:rPr>
-        <w:t xml:space="preserve">                    </w:t>
-      </w:r>
-      <w:r>
-        <w:rPr>
-          <w:b/>
-          <w:bCs/>
-        </w:rPr>
-        <w:t xml:space="preserve">│ </w:t>
-      </w:r>
-      <w:r>
-        <w:rPr>
-          <w:b/>
-          <w:bCs/>
-        </w:rPr>
-        <w:t xml:space="preserve">       </w:t>
-      </w:r>
-      <w:r>
-        <w:rPr>
-          <w:b/>
-          <w:bCs/>
-        </w:rPr>
-        <w:t xml:space="preserve">   RouterDelegate   </w:t>
-      </w:r>
-      <w:r>
-        <w:rPr>
-          <w:b/>
-          <w:bCs/>
-        </w:rPr>
-        <w:t xml:space="preserve">   </w:t>
-      </w:r>
-      <w:r>
-        <w:rPr>
-          <w:b/>
-          <w:bCs/>
-        </w:rPr>
-        <w:t xml:space="preserve">  │      </w:t>
-      </w:r>
-      <w:r>
-        <w:rPr>
-          <w:b/>
-          <w:bCs/>
-        </w:rPr>
-        <w:t xml:space="preserve">             </w:t>
-      </w:r>
-      <w:r>
-        <w:rPr>
-          <w:b/>
-          <w:bCs/>
-        </w:rPr>
-        <w:t xml:space="preserve"> │</w:t>
-      </w:r>
-    </w:p>
-    <w:p>
-      <w:pPr>
-        <w:jc w:val="both"/>
-        <w:rPr>
-          <w:b/>
-          <w:bCs/>
-        </w:rPr>
-      </w:pPr>
-      <w:r>
-        <w:rPr>
-          <w:b/>
-          <w:bCs/>
-        </w:rPr>
-        <w:t xml:space="preserve">                   </w:t>
-      </w:r>
-      <w:r>
-        <w:rPr>
-          <w:b/>
-          <w:bCs/>
-        </w:rPr>
-        <w:t xml:space="preserve">                      </w:t>
-      </w:r>
-      <w:r>
-        <w:rPr>
-          <w:b/>
-          <w:bCs/>
-        </w:rPr>
-        <w:t xml:space="preserve"> │  </w:t>
-      </w:r>
-      <w:r>
-        <w:rPr>
-          <w:b/>
-          <w:bCs/>
-        </w:rPr>
-        <w:t xml:space="preserve">                    </w:t>
-      </w:r>
-      <w:r>
-        <w:rPr>
-          <w:b/>
-          <w:bCs/>
-        </w:rPr>
-        <w:t>└──────────</w:t>
-      </w:r>
-      <w:r>
-        <w:rPr>
-          <w:rFonts w:ascii="Arial" w:hAnsi="Arial" w:cs="Arial"/>
-          <w:b/>
-          <w:bCs/>
-        </w:rPr>
-        <w:t>┬</w:t>
-      </w:r>
-      <w:r>
-        <w:rPr>
-          <w:rFonts w:ascii="Aptos" w:hAnsi="Aptos" w:cs="Aptos"/>
-          <w:b/>
-          <w:bCs/>
-        </w:rPr>
-        <w:t>───────────┘</w:t>
-      </w:r>
-      <w:r>
-        <w:rPr>
-          <w:b/>
-          <w:bCs/>
-        </w:rPr>
-        <w:t xml:space="preserve">       </w:t>
-      </w:r>
-      <w:r>
-        <w:rPr>
-          <w:b/>
-          <w:bCs/>
-        </w:rPr>
-        <w:t xml:space="preserve">            </w:t>
-      </w:r>
-      <w:r>
-        <w:rPr>
-          <w:rFonts w:ascii="Aptos" w:hAnsi="Aptos" w:cs="Aptos"/>
-          <w:b/>
-          <w:bCs/>
-        </w:rPr>
-        <w:t>│</w:t>
-      </w:r>
-    </w:p>
-    <w:p>
-      <w:pPr>
-        <w:jc w:val="both"/>
-        <w:rPr>
-          <w:b/>
-          <w:bCs/>
-        </w:rPr>
-      </w:pPr>
-      <w:r>
-        <w:rPr>
-          <w:b/>
-          <w:bCs/>
-        </w:rPr>
-        <w:t xml:space="preserve">                    </w:t>
-      </w:r>
-      <w:r>
-        <w:rPr>
-          <w:b/>
-          <w:bCs/>
-        </w:rPr>
-        <w:t xml:space="preserve">                      </w:t>
-      </w:r>
-      <w:r>
-        <w:rPr>
-          <w:b/>
-          <w:bCs/>
-        </w:rPr>
-        <w:t>└──</w:t>
-      </w:r>
-      <w:r>
-        <w:rPr>
-          <w:rFonts w:ascii="Aptos" w:hAnsi="Aptos" w:cs="Aptos"/>
-          <w:b/>
-          <w:bCs/>
-        </w:rPr>
-        <w:t>───────</w:t>
-      </w:r>
-      <w:r>
-        <w:rPr>
-          <w:b/>
-          <w:bCs/>
-        </w:rPr>
-        <w:t>───────────</w:t>
-      </w:r>
-      <w:r>
-        <w:rPr>
-          <w:rFonts w:ascii="Arial" w:hAnsi="Arial" w:cs="Arial"/>
-          <w:b/>
-          <w:bCs/>
-        </w:rPr>
-        <w:t>┼</w:t>
-      </w:r>
-      <w:r>
-        <w:rPr>
-          <w:rFonts w:ascii="Aptos" w:hAnsi="Aptos" w:cs="Aptos"/>
-          <w:b/>
-          <w:bCs/>
-        </w:rPr>
-        <w:t>────────────────────┘</w:t>
-      </w:r>
-    </w:p>
-    <w:p>
-      <w:pPr>
-        <w:jc w:val="both"/>
-        <w:rPr>
-          <w:b/>
-          <w:bCs/>
-        </w:rPr>
-      </w:pPr>
-      <w:r>
-        <w:rPr>
-          <w:b/>
-          <w:bCs/>
-        </w:rPr>
-        <w:t xml:space="preserve">                                  </w:t>
-      </w:r>
-      <w:r>
-        <w:rPr>
-          <w:b/>
-          <w:bCs/>
-        </w:rPr>
-        <w:t xml:space="preserve">                                                           </w:t>
-      </w:r>
-      <w:r>
-        <w:rPr>
-          <w:rFonts w:ascii="Arial" w:hAnsi="Arial" w:cs="Arial"/>
-          <w:b/>
-          <w:bCs/>
-        </w:rPr>
-        <w:t>▼</w:t>
-      </w:r>
-    </w:p>
-    <w:p>
-      <w:pPr>
-        <w:jc w:val="both"/>
-        <w:rPr>
-          <w:b/>
-          <w:bCs/>
-        </w:rPr>
-      </w:pPr>
-      <w:r>
-        <w:rPr>
-          <w:b/>
-          <w:bCs/>
-        </w:rPr>
-        <w:t xml:space="preserve">                     </w:t>
-      </w:r>
-      <w:r>
-        <w:rPr>
-          <w:b/>
-          <w:bCs/>
-        </w:rPr>
-        <w:t xml:space="preserve">                            </w:t>
-      </w:r>
-      <w:proofErr w:type="gramStart"/>
-      <w:r>
-        <w:rPr>
-          <w:b/>
-          <w:bCs/>
-        </w:rPr>
-        <w:t>Navigator(</w:t>
-      </w:r>
-      <w:proofErr w:type="gramEnd"/>
-      <w:r>
-        <w:rPr>
-          <w:b/>
-          <w:bCs/>
-        </w:rPr>
-        <w:t>pages: [</w:t>
-      </w:r>
-      <w:proofErr w:type="spellStart"/>
-      <w:r>
-        <w:rPr>
-          <w:b/>
-          <w:bCs/>
-        </w:rPr>
-        <w:t>HomePage</w:t>
-      </w:r>
-      <w:proofErr w:type="spellEnd"/>
-      <w:r>
-        <w:rPr>
-          <w:b/>
-          <w:bCs/>
-        </w:rPr>
-        <w:t>, DetailsPage])</w:t>
-      </w:r>
-    </w:p>
-    <w:p>
-      <w:pPr>
-        <w:jc w:val="both"/>
-        <w:rPr>
-          <w:b/>
-          <w:bCs/>
-        </w:rPr>
-      </w:pPr>
-      <w:r>
-        <w:rPr>
-          <w:b/>
-          <w:bCs/>
-        </w:rPr>
-        <w:lastRenderedPageBreak/>
-        <w:t xml:space="preserve">                                  </w:t>
-      </w:r>
-      <w:r>
-        <w:rPr>
-          <w:b/>
-          <w:bCs/>
-        </w:rPr>
-        <w:t xml:space="preserve">                                                            </w:t>
-      </w:r>
-      <w:r>
-        <w:rPr>
-          <w:b/>
-          <w:bCs/>
-        </w:rPr>
-        <w:t>│</w:t>
-      </w:r>
-    </w:p>
-    <w:p>
-      <w:pPr>
-        <w:jc w:val="both"/>
-        <w:rPr>
-          <w:b/>
-          <w:bCs/>
-        </w:rPr>
-      </w:pPr>
-      <w:r>
-        <w:rPr>
-          <w:b/>
-          <w:bCs/>
-        </w:rPr>
-        <w:t xml:space="preserve">                                  </w:t>
-      </w:r>
-      <w:r>
-        <w:rPr>
-          <w:b/>
-          <w:bCs/>
-        </w:rPr>
-        <w:t xml:space="preserve">                                                           </w:t>
-      </w:r>
-      <w:r>
-        <w:rPr>
-          <w:rFonts w:ascii="Arial" w:hAnsi="Arial" w:cs="Arial"/>
-          <w:b/>
-          <w:bCs/>
-        </w:rPr>
-        <w:t>▼</w:t>
-      </w:r>
-    </w:p>
-    <w:p>
-      <w:pPr>
-        <w:jc w:val="both"/>
-        <w:rPr>
-          <w:b/>
-          <w:bCs/>
-        </w:rPr>
-      </w:pPr>
-      <w:r>
-        <w:rPr>
-          <w:b/>
-          <w:bCs/>
-        </w:rPr>
-        <w:t xml:space="preserve">                         </w:t>
-      </w:r>
-      <w:r>
-        <w:rPr>
-          <w:b/>
-          <w:bCs/>
-        </w:rPr>
-        <w:t xml:space="preserve">                                              </w:t>
-      </w:r>
-      <w:r>
-        <w:rPr>
-          <w:b/>
-          <w:bCs/>
-        </w:rPr>
-        <w:t xml:space="preserve"> rendered on screen</w:t>
+    </w:p>
+    <w:p>
+      <w:pPr>
+        <w:jc w:val="both"/>
+      </w:pPr>
+      <w:r>
+        <w:t xml:space="preserve">                                                                        rendered on screen</w:t>
       </w:r>
     </w:p>
     <w:p>
@@ -2549,16 +1586,7 @@
           <w:sz w:val="32"/>
           <w:szCs w:val="32"/>
         </w:rPr>
-        <w:t>routes</w:t>
-      </w:r>
-      <w:r>
-        <w:rPr>
-          <w:b/>
-          <w:bCs/>
-          <w:sz w:val="32"/>
-          <w:szCs w:val="32"/>
-        </w:rPr>
-        <w:t>:</w:t>
+        <w:t>routes:</w:t>
       </w:r>
       <w:r>
         <w:rPr>
@@ -2566,20 +1594,7 @@
           <w:szCs w:val="32"/>
         </w:rPr>
         <w:tab/>
-      </w:r>
-      <w:r>
-        <w:rPr>
-          <w:sz w:val="32"/>
-          <w:szCs w:val="32"/>
-        </w:rPr>
-        <w:t>takes the</w:t>
-      </w:r>
-      <w:r>
-        <w:rPr>
-          <w:sz w:val="32"/>
-          <w:szCs w:val="32"/>
-        </w:rPr>
-        <w:t xml:space="preserve"> list of </w:t>
+        <w:t xml:space="preserve">takes the list of </w:t>
       </w:r>
       <w:proofErr w:type="spellStart"/>
       <w:r>
@@ -2597,14 +1612,7 @@
           <w:sz w:val="32"/>
           <w:szCs w:val="32"/>
         </w:rPr>
-        <w:t xml:space="preserve"> or</w:t>
-      </w:r>
-      <w:r>
-        <w:rPr>
-          <w:sz w:val="32"/>
-          <w:szCs w:val="32"/>
-        </w:rPr>
-        <w:t xml:space="preserve"> our entire route tree</w:t>
+        <w:t xml:space="preserve"> or our entire route tree</w:t>
       </w:r>
     </w:p>
     <w:p>
@@ -2645,14 +1653,7 @@
           <w:sz w:val="32"/>
           <w:szCs w:val="32"/>
         </w:rPr>
-        <w:t xml:space="preserve"> w</w:t>
-      </w:r>
-      <w:r>
-        <w:rPr>
-          <w:sz w:val="32"/>
-          <w:szCs w:val="32"/>
-        </w:rPr>
-        <w:t>here the app starts if there's no deep link (defaults to /)</w:t>
+        <w:t xml:space="preserve"> where the app starts if there's no deep link (defaults to /)</w:t>
       </w:r>
     </w:p>
     <w:p>
@@ -2702,21 +1703,7 @@
           <w:sz w:val="32"/>
           <w:szCs w:val="32"/>
         </w:rPr>
-        <w:t>p</w:t>
-      </w:r>
-      <w:r>
-        <w:rPr>
-          <w:sz w:val="32"/>
-          <w:szCs w:val="32"/>
-        </w:rPr>
-        <w:t>rints every route match/parse to console</w:t>
-      </w:r>
-      <w:r>
-        <w:rPr>
-          <w:sz w:val="32"/>
-          <w:szCs w:val="32"/>
-        </w:rPr>
-        <w:t xml:space="preserve"> (easier debugging)</w:t>
+        <w:t>prints every route match/parse to console (easier debugging)</w:t>
       </w:r>
     </w:p>
     <w:p>
@@ -2758,21 +1745,7 @@
           <w:szCs w:val="32"/>
         </w:rPr>
         <w:tab/>
-        <w:t xml:space="preserve">Fallback screen when no route matches </w:t>
-      </w:r>
-      <w:r>
-        <w:rPr>
-          <w:sz w:val="32"/>
-          <w:szCs w:val="32"/>
-        </w:rPr>
-        <w:t>(SEE BELOW</w:t>
-      </w:r>
-      <w:r>
-        <w:rPr>
-          <w:sz w:val="32"/>
-          <w:szCs w:val="32"/>
-        </w:rPr>
-        <w:t>)</w:t>
+        <w:t>Fallback screen when no route matches (SEE BELOW)</w:t>
       </w:r>
     </w:p>
     <w:p>
@@ -2886,53 +1859,14 @@
           <w:sz w:val="32"/>
           <w:szCs w:val="32"/>
         </w:rPr>
-        <w:t>p</w:t>
-      </w:r>
-      <w:r>
-        <w:rPr>
-          <w:b/>
-          <w:bCs/>
-          <w:sz w:val="32"/>
-          <w:szCs w:val="32"/>
-        </w:rPr>
-        <w:t>ath</w:t>
-      </w:r>
-      <w:r>
-        <w:rPr>
-          <w:b/>
-          <w:bCs/>
-          <w:sz w:val="32"/>
-          <w:szCs w:val="32"/>
-        </w:rPr>
-        <w:t>:</w:t>
-      </w:r>
-      <w:r>
-        <w:rPr>
-          <w:sz w:val="32"/>
-          <w:szCs w:val="32"/>
-        </w:rPr>
-        <w:t xml:space="preserve"> t</w:t>
-      </w:r>
-      <w:r>
-        <w:rPr>
-          <w:sz w:val="32"/>
-          <w:szCs w:val="32"/>
-        </w:rPr>
-        <w:t>he URL segment this route matches (:id = param,</w:t>
-      </w:r>
-      <w:r>
-        <w:rPr>
-          <w:sz w:val="32"/>
-          <w:szCs w:val="32"/>
-        </w:rPr>
-        <w:t xml:space="preserve"> SEE BELOW</w:t>
-      </w:r>
-      <w:r>
-        <w:rPr>
-          <w:sz w:val="32"/>
-          <w:szCs w:val="32"/>
-        </w:rPr>
-        <w:t>)</w:t>
+        <w:t>path:</w:t>
+      </w:r>
+      <w:r>
+        <w:rPr>
+          <w:sz w:val="32"/>
+          <w:szCs w:val="32"/>
+        </w:rPr>
+        <w:t xml:space="preserve"> the URL segment this route matches (:id = param, SEE BELOW)</w:t>
       </w:r>
     </w:p>
     <w:p>
@@ -2955,16 +1889,7 @@
           <w:sz w:val="32"/>
           <w:szCs w:val="32"/>
         </w:rPr>
-        <w:t>builder</w:t>
-      </w:r>
-      <w:r>
-        <w:rPr>
-          <w:b/>
-          <w:bCs/>
-          <w:sz w:val="32"/>
-          <w:szCs w:val="32"/>
-        </w:rPr>
-        <w:t>:</w:t>
+        <w:t>builder:</w:t>
       </w:r>
       <w:r>
         <w:rPr>
@@ -3716,17 +2641,13 @@
       <w:pPr>
         <w:jc w:val="both"/>
         <w:rPr>
-          <w:b/>
-          <w:bCs/>
-          <w:color w:val="D86DCB" w:themeColor="accent5" w:themeTint="99"/>
-          <w:sz w:val="32"/>
-          <w:szCs w:val="32"/>
-        </w:rPr>
-      </w:pPr>
-      <w:r>
-        <w:rPr>
-          <w:b/>
-          <w:bCs/>
+          <w:color w:val="D86DCB" w:themeColor="accent5" w:themeTint="99"/>
+          <w:sz w:val="32"/>
+          <w:szCs w:val="32"/>
+        </w:rPr>
+      </w:pPr>
+      <w:r>
+        <w:rPr>
           <w:color w:val="D86DCB" w:themeColor="accent5" w:themeTint="99"/>
           <w:sz w:val="32"/>
           <w:szCs w:val="32"/>
@@ -3736,8 +2657,6 @@
       <w:proofErr w:type="spellStart"/>
       <w:r>
         <w:rPr>
-          <w:b/>
-          <w:bCs/>
           <w:color w:val="D86DCB" w:themeColor="accent5" w:themeTint="99"/>
           <w:sz w:val="32"/>
           <w:szCs w:val="32"/>
@@ -3747,8 +2666,6 @@
       <w:proofErr w:type="spellEnd"/>
       <w:r>
         <w:rPr>
-          <w:b/>
-          <w:bCs/>
           <w:color w:val="D86DCB" w:themeColor="accent5" w:themeTint="99"/>
           <w:sz w:val="32"/>
           <w:szCs w:val="32"/>
@@ -3758,8 +2675,6 @@
       <w:proofErr w:type="spellStart"/>
       <w:r>
         <w:rPr>
-          <w:b/>
-          <w:bCs/>
           <w:color w:val="D86DCB" w:themeColor="accent5" w:themeTint="99"/>
           <w:sz w:val="32"/>
           <w:szCs w:val="32"/>
@@ -3769,8 +2684,6 @@
       <w:proofErr w:type="spellEnd"/>
       <w:r>
         <w:rPr>
-          <w:b/>
-          <w:bCs/>
           <w:color w:val="D86DCB" w:themeColor="accent5" w:themeTint="99"/>
           <w:sz w:val="32"/>
           <w:szCs w:val="32"/>
@@ -3782,17 +2695,13 @@
       <w:pPr>
         <w:jc w:val="both"/>
         <w:rPr>
-          <w:b/>
-          <w:bCs/>
-          <w:color w:val="D86DCB" w:themeColor="accent5" w:themeTint="99"/>
-          <w:sz w:val="32"/>
-          <w:szCs w:val="32"/>
-        </w:rPr>
-      </w:pPr>
-      <w:r>
-        <w:rPr>
-          <w:b/>
-          <w:bCs/>
+          <w:color w:val="D86DCB" w:themeColor="accent5" w:themeTint="99"/>
+          <w:sz w:val="32"/>
+          <w:szCs w:val="32"/>
+        </w:rPr>
+      </w:pPr>
+      <w:r>
+        <w:rPr>
           <w:color w:val="D86DCB" w:themeColor="accent5" w:themeTint="99"/>
           <w:sz w:val="32"/>
           <w:szCs w:val="32"/>
@@ -3801,8 +2710,6 @@
       </w:r>
       <w:r>
         <w:rPr>
-          <w:b/>
-          <w:bCs/>
           <w:color w:val="D86DCB" w:themeColor="accent5" w:themeTint="99"/>
           <w:sz w:val="32"/>
           <w:szCs w:val="32"/>
@@ -3811,8 +2718,6 @@
       </w:r>
       <w:r>
         <w:rPr>
-          <w:b/>
-          <w:bCs/>
           <w:color w:val="D86DCB" w:themeColor="accent5" w:themeTint="99"/>
           <w:sz w:val="32"/>
           <w:szCs w:val="32"/>
@@ -3823,8 +2728,6 @@
       <w:proofErr w:type="gramStart"/>
       <w:r>
         <w:rPr>
-          <w:b/>
-          <w:bCs/>
           <w:color w:val="D86DCB" w:themeColor="accent5" w:themeTint="99"/>
           <w:sz w:val="32"/>
           <w:szCs w:val="32"/>
@@ -3834,8 +2737,6 @@
       <w:proofErr w:type="spellEnd"/>
       <w:r>
         <w:rPr>
-          <w:b/>
-          <w:bCs/>
           <w:color w:val="D86DCB" w:themeColor="accent5" w:themeTint="99"/>
           <w:sz w:val="32"/>
           <w:szCs w:val="32"/>
@@ -3848,38 +2749,22 @@
       <w:pPr>
         <w:jc w:val="both"/>
         <w:rPr>
-          <w:b/>
-          <w:bCs/>
-          <w:color w:val="D86DCB" w:themeColor="accent5" w:themeTint="99"/>
-          <w:sz w:val="32"/>
-          <w:szCs w:val="32"/>
-        </w:rPr>
-      </w:pPr>
-      <w:r>
-        <w:rPr>
-          <w:b/>
-          <w:bCs/>
-          <w:color w:val="D86DCB" w:themeColor="accent5" w:themeTint="99"/>
-          <w:sz w:val="32"/>
-          <w:szCs w:val="32"/>
-        </w:rPr>
-        <w:t xml:space="preserve">  </w:t>
-      </w:r>
-      <w:r>
-        <w:rPr>
-          <w:b/>
-          <w:bCs/>
-          <w:color w:val="D86DCB" w:themeColor="accent5" w:themeTint="99"/>
-          <w:sz w:val="32"/>
-          <w:szCs w:val="32"/>
-        </w:rPr>
-        <w:t xml:space="preserve">    </w:t>
-      </w:r>
-      <w:proofErr w:type="spellStart"/>
-      <w:r>
-        <w:rPr>
-          <w:b/>
-          <w:bCs/>
+          <w:color w:val="D86DCB" w:themeColor="accent5" w:themeTint="99"/>
+          <w:sz w:val="32"/>
+          <w:szCs w:val="32"/>
+        </w:rPr>
+      </w:pPr>
+      <w:r>
+        <w:rPr>
+          <w:color w:val="D86DCB" w:themeColor="accent5" w:themeTint="99"/>
+          <w:sz w:val="32"/>
+          <w:szCs w:val="32"/>
+        </w:rPr>
+        <w:t xml:space="preserve">      </w:t>
+      </w:r>
+      <w:proofErr w:type="spellStart"/>
+      <w:r>
+        <w:rPr>
           <w:color w:val="D86DCB" w:themeColor="accent5" w:themeTint="99"/>
           <w:sz w:val="32"/>
           <w:szCs w:val="32"/>
@@ -3889,8 +2774,6 @@
       <w:proofErr w:type="spellEnd"/>
       <w:r>
         <w:rPr>
-          <w:b/>
-          <w:bCs/>
           <w:color w:val="D86DCB" w:themeColor="accent5" w:themeTint="99"/>
           <w:sz w:val="32"/>
           <w:szCs w:val="32"/>
@@ -3902,38 +2785,22 @@
       <w:pPr>
         <w:jc w:val="both"/>
         <w:rPr>
-          <w:b/>
-          <w:bCs/>
-          <w:color w:val="D86DCB" w:themeColor="accent5" w:themeTint="99"/>
-          <w:sz w:val="32"/>
-          <w:szCs w:val="32"/>
-        </w:rPr>
-      </w:pPr>
-      <w:r>
-        <w:rPr>
-          <w:b/>
-          <w:bCs/>
-          <w:color w:val="D86DCB" w:themeColor="accent5" w:themeTint="99"/>
-          <w:sz w:val="32"/>
-          <w:szCs w:val="32"/>
-        </w:rPr>
-        <w:t xml:space="preserve">  </w:t>
-      </w:r>
-      <w:r>
-        <w:rPr>
-          <w:b/>
-          <w:bCs/>
-          <w:color w:val="D86DCB" w:themeColor="accent5" w:themeTint="99"/>
-          <w:sz w:val="32"/>
-          <w:szCs w:val="32"/>
-        </w:rPr>
-        <w:t xml:space="preserve">    </w:t>
-      </w:r>
-      <w:proofErr w:type="spellStart"/>
-      <w:r>
-        <w:rPr>
-          <w:b/>
-          <w:bCs/>
+          <w:color w:val="D86DCB" w:themeColor="accent5" w:themeTint="99"/>
+          <w:sz w:val="32"/>
+          <w:szCs w:val="32"/>
+        </w:rPr>
+      </w:pPr>
+      <w:r>
+        <w:rPr>
+          <w:color w:val="D86DCB" w:themeColor="accent5" w:themeTint="99"/>
+          <w:sz w:val="32"/>
+          <w:szCs w:val="32"/>
+        </w:rPr>
+        <w:t xml:space="preserve">      </w:t>
+      </w:r>
+      <w:proofErr w:type="spellStart"/>
+      <w:r>
+        <w:rPr>
           <w:color w:val="D86DCB" w:themeColor="accent5" w:themeTint="99"/>
           <w:sz w:val="32"/>
           <w:szCs w:val="32"/>
@@ -3943,8 +2810,6 @@
       <w:proofErr w:type="spellEnd"/>
       <w:r>
         <w:rPr>
-          <w:b/>
-          <w:bCs/>
           <w:color w:val="D86DCB" w:themeColor="accent5" w:themeTint="99"/>
           <w:sz w:val="32"/>
           <w:szCs w:val="32"/>
@@ -3956,81 +2821,41 @@
       <w:pPr>
         <w:jc w:val="both"/>
         <w:rPr>
-          <w:b/>
-          <w:bCs/>
-          <w:color w:val="D86DCB" w:themeColor="accent5" w:themeTint="99"/>
-          <w:sz w:val="32"/>
-          <w:szCs w:val="32"/>
-        </w:rPr>
-      </w:pPr>
-      <w:r>
-        <w:rPr>
-          <w:b/>
-          <w:bCs/>
-          <w:color w:val="D86DCB" w:themeColor="accent5" w:themeTint="99"/>
-          <w:sz w:val="32"/>
-          <w:szCs w:val="32"/>
-        </w:rPr>
-        <w:t xml:space="preserve">  </w:t>
-      </w:r>
-      <w:r>
-        <w:rPr>
-          <w:b/>
-          <w:bCs/>
-          <w:color w:val="D86DCB" w:themeColor="accent5" w:themeTint="99"/>
-          <w:sz w:val="32"/>
-          <w:szCs w:val="32"/>
-        </w:rPr>
-        <w:t xml:space="preserve">    </w:t>
-      </w:r>
-      <w:r>
-        <w:rPr>
-          <w:b/>
-          <w:bCs/>
-          <w:color w:val="D86DCB" w:themeColor="accent5" w:themeTint="99"/>
-          <w:sz w:val="32"/>
-          <w:szCs w:val="32"/>
-        </w:rPr>
-        <w:t>routes: [</w:t>
-      </w:r>
-    </w:p>
-    <w:p>
-      <w:pPr>
-        <w:jc w:val="both"/>
-        <w:rPr>
-          <w:b/>
-          <w:bCs/>
-          <w:color w:val="D86DCB" w:themeColor="accent5" w:themeTint="99"/>
-          <w:sz w:val="32"/>
-          <w:szCs w:val="32"/>
-        </w:rPr>
-      </w:pPr>
-      <w:r>
-        <w:rPr>
-          <w:b/>
-          <w:bCs/>
-          <w:color w:val="D86DCB" w:themeColor="accent5" w:themeTint="99"/>
-          <w:sz w:val="32"/>
-          <w:szCs w:val="32"/>
-        </w:rPr>
-        <w:t xml:space="preserve">    </w:t>
-      </w:r>
-      <w:r>
-        <w:rPr>
-          <w:b/>
-          <w:bCs/>
-          <w:color w:val="D86DCB" w:themeColor="accent5" w:themeTint="99"/>
-          <w:sz w:val="32"/>
-          <w:szCs w:val="32"/>
-        </w:rPr>
-        <w:t xml:space="preserve">     </w:t>
+          <w:color w:val="D86DCB" w:themeColor="accent5" w:themeTint="99"/>
+          <w:sz w:val="32"/>
+          <w:szCs w:val="32"/>
+        </w:rPr>
+      </w:pPr>
+      <w:r>
+        <w:rPr>
+          <w:color w:val="D86DCB" w:themeColor="accent5" w:themeTint="99"/>
+          <w:sz w:val="32"/>
+          <w:szCs w:val="32"/>
+        </w:rPr>
+        <w:t xml:space="preserve">      routes: [</w:t>
+      </w:r>
+    </w:p>
+    <w:p>
+      <w:pPr>
+        <w:jc w:val="both"/>
+        <w:rPr>
+          <w:color w:val="D86DCB" w:themeColor="accent5" w:themeTint="99"/>
+          <w:sz w:val="32"/>
+          <w:szCs w:val="32"/>
+        </w:rPr>
+      </w:pPr>
+      <w:r>
+        <w:rPr>
+          <w:color w:val="D86DCB" w:themeColor="accent5" w:themeTint="99"/>
+          <w:sz w:val="32"/>
+          <w:szCs w:val="32"/>
+        </w:rPr>
+        <w:t xml:space="preserve">         </w:t>
       </w:r>
       <w:proofErr w:type="spellStart"/>
       <w:proofErr w:type="gramStart"/>
       <w:r>
         <w:rPr>
-          <w:b/>
-          <w:bCs/>
           <w:color w:val="D86DCB" w:themeColor="accent5" w:themeTint="99"/>
           <w:sz w:val="32"/>
           <w:szCs w:val="32"/>
@@ -4040,8 +2865,6 @@
       <w:proofErr w:type="spellEnd"/>
       <w:r>
         <w:rPr>
-          <w:b/>
-          <w:bCs/>
           <w:color w:val="D86DCB" w:themeColor="accent5" w:themeTint="99"/>
           <w:sz w:val="32"/>
           <w:szCs w:val="32"/>
@@ -4054,131 +2877,41 @@
       <w:pPr>
         <w:jc w:val="both"/>
         <w:rPr>
-          <w:b/>
-          <w:bCs/>
-          <w:color w:val="D86DCB" w:themeColor="accent5" w:themeTint="99"/>
-          <w:sz w:val="32"/>
-          <w:szCs w:val="32"/>
-        </w:rPr>
-      </w:pPr>
-      <w:r>
-        <w:rPr>
-          <w:b/>
-          <w:bCs/>
-          <w:color w:val="D86DCB" w:themeColor="accent5" w:themeTint="99"/>
-          <w:sz w:val="32"/>
-          <w:szCs w:val="32"/>
-        </w:rPr>
-        <w:t xml:space="preserve">     </w:t>
-      </w:r>
-      <w:r>
-        <w:rPr>
-          <w:b/>
-          <w:bCs/>
-          <w:color w:val="D86DCB" w:themeColor="accent5" w:themeTint="99"/>
-          <w:sz w:val="32"/>
-          <w:szCs w:val="32"/>
-        </w:rPr>
-        <w:t xml:space="preserve"> </w:t>
-      </w:r>
-      <w:r>
-        <w:rPr>
-          <w:b/>
-          <w:bCs/>
-          <w:color w:val="D86DCB" w:themeColor="accent5" w:themeTint="99"/>
-          <w:sz w:val="32"/>
-          <w:szCs w:val="32"/>
-        </w:rPr>
-        <w:t xml:space="preserve"> </w:t>
-      </w:r>
-      <w:r>
-        <w:rPr>
-          <w:b/>
-          <w:bCs/>
-          <w:color w:val="D86DCB" w:themeColor="accent5" w:themeTint="99"/>
-          <w:sz w:val="32"/>
-          <w:szCs w:val="32"/>
-        </w:rPr>
-        <w:t xml:space="preserve">      </w:t>
-      </w:r>
-      <w:r>
-        <w:rPr>
-          <w:b/>
-          <w:bCs/>
-          <w:color w:val="D86DCB" w:themeColor="accent5" w:themeTint="99"/>
-          <w:sz w:val="32"/>
-          <w:szCs w:val="32"/>
-        </w:rPr>
-        <w:t>path: '/',</w:t>
-      </w:r>
-    </w:p>
-    <w:p>
-      <w:pPr>
-        <w:jc w:val="both"/>
-        <w:rPr>
-          <w:b/>
-          <w:bCs/>
-          <w:color w:val="D86DCB" w:themeColor="accent5" w:themeTint="99"/>
-          <w:sz w:val="32"/>
-          <w:szCs w:val="32"/>
-        </w:rPr>
-      </w:pPr>
-      <w:r>
-        <w:rPr>
-          <w:b/>
-          <w:bCs/>
-          <w:color w:val="D86DCB" w:themeColor="accent5" w:themeTint="99"/>
-          <w:sz w:val="32"/>
-          <w:szCs w:val="32"/>
-        </w:rPr>
-        <w:t xml:space="preserve">    </w:t>
-      </w:r>
-      <w:r>
-        <w:rPr>
-          <w:b/>
-          <w:bCs/>
-          <w:color w:val="D86DCB" w:themeColor="accent5" w:themeTint="99"/>
-          <w:sz w:val="32"/>
-          <w:szCs w:val="32"/>
-        </w:rPr>
-        <w:t xml:space="preserve"> </w:t>
-      </w:r>
-      <w:r>
-        <w:rPr>
-          <w:b/>
-          <w:bCs/>
-          <w:color w:val="D86DCB" w:themeColor="accent5" w:themeTint="99"/>
-          <w:sz w:val="32"/>
-          <w:szCs w:val="32"/>
-        </w:rPr>
-        <w:t xml:space="preserve"> </w:t>
-      </w:r>
-      <w:r>
-        <w:rPr>
-          <w:b/>
-          <w:bCs/>
-          <w:color w:val="D86DCB" w:themeColor="accent5" w:themeTint="99"/>
-          <w:sz w:val="32"/>
-          <w:szCs w:val="32"/>
-        </w:rPr>
-        <w:t xml:space="preserve">      </w:t>
-      </w:r>
-      <w:r>
-        <w:rPr>
-          <w:b/>
-          <w:bCs/>
-          <w:color w:val="D86DCB" w:themeColor="accent5" w:themeTint="99"/>
-          <w:sz w:val="32"/>
-          <w:szCs w:val="32"/>
-        </w:rPr>
-        <w:t xml:space="preserve"> builder: (context, state) =&gt; const </w:t>
+          <w:color w:val="D86DCB" w:themeColor="accent5" w:themeTint="99"/>
+          <w:sz w:val="32"/>
+          <w:szCs w:val="32"/>
+        </w:rPr>
+      </w:pPr>
+      <w:r>
+        <w:rPr>
+          <w:color w:val="D86DCB" w:themeColor="accent5" w:themeTint="99"/>
+          <w:sz w:val="32"/>
+          <w:szCs w:val="32"/>
+        </w:rPr>
+        <w:t xml:space="preserve">             path: '/',</w:t>
+      </w:r>
+    </w:p>
+    <w:p>
+      <w:pPr>
+        <w:jc w:val="both"/>
+        <w:rPr>
+          <w:color w:val="D86DCB" w:themeColor="accent5" w:themeTint="99"/>
+          <w:sz w:val="32"/>
+          <w:szCs w:val="32"/>
+        </w:rPr>
+      </w:pPr>
+      <w:r>
+        <w:rPr>
+          <w:color w:val="D86DCB" w:themeColor="accent5" w:themeTint="99"/>
+          <w:sz w:val="32"/>
+          <w:szCs w:val="32"/>
+        </w:rPr>
+        <w:t xml:space="preserve">             builder: (context, state) =&gt; const </w:t>
       </w:r>
       <w:proofErr w:type="spellStart"/>
       <w:proofErr w:type="gramStart"/>
       <w:r>
         <w:rPr>
-          <w:b/>
-          <w:bCs/>
           <w:color w:val="D86DCB" w:themeColor="accent5" w:themeTint="99"/>
           <w:sz w:val="32"/>
           <w:szCs w:val="32"/>
@@ -4188,8 +2921,6 @@
       <w:proofErr w:type="spellEnd"/>
       <w:r>
         <w:rPr>
-          <w:b/>
-          <w:bCs/>
           <w:color w:val="D86DCB" w:themeColor="accent5" w:themeTint="99"/>
           <w:sz w:val="32"/>
           <w:szCs w:val="32"/>
@@ -4199,8 +2930,6 @@
       <w:proofErr w:type="gramEnd"/>
       <w:r>
         <w:rPr>
-          <w:b/>
-          <w:bCs/>
           <w:color w:val="D86DCB" w:themeColor="accent5" w:themeTint="99"/>
           <w:sz w:val="32"/>
           <w:szCs w:val="32"/>
@@ -4212,133 +2941,67 @@
       <w:pPr>
         <w:jc w:val="both"/>
         <w:rPr>
-          <w:b/>
-          <w:bCs/>
-          <w:color w:val="D86DCB" w:themeColor="accent5" w:themeTint="99"/>
-          <w:sz w:val="32"/>
-          <w:szCs w:val="32"/>
-        </w:rPr>
-      </w:pPr>
-      <w:r>
-        <w:rPr>
-          <w:b/>
-          <w:bCs/>
-          <w:color w:val="D86DCB" w:themeColor="accent5" w:themeTint="99"/>
-          <w:sz w:val="32"/>
-          <w:szCs w:val="32"/>
-        </w:rPr>
-        <w:t xml:space="preserve">    </w:t>
-      </w:r>
-      <w:r>
-        <w:rPr>
-          <w:b/>
-          <w:bCs/>
-          <w:color w:val="D86DCB" w:themeColor="accent5" w:themeTint="99"/>
-          <w:sz w:val="32"/>
-          <w:szCs w:val="32"/>
-        </w:rPr>
-        <w:t xml:space="preserve">      </w:t>
-      </w:r>
-      <w:r>
-        <w:rPr>
-          <w:b/>
-          <w:bCs/>
-          <w:color w:val="D86DCB" w:themeColor="accent5" w:themeTint="99"/>
-          <w:sz w:val="32"/>
-          <w:szCs w:val="32"/>
-        </w:rPr>
-        <w:t>),</w:t>
-      </w:r>
-    </w:p>
-    <w:p>
-      <w:pPr>
-        <w:jc w:val="both"/>
-        <w:rPr>
-          <w:b/>
-          <w:bCs/>
-          <w:color w:val="D86DCB" w:themeColor="accent5" w:themeTint="99"/>
-          <w:sz w:val="32"/>
-          <w:szCs w:val="32"/>
-        </w:rPr>
-      </w:pPr>
-      <w:r>
-        <w:rPr>
-          <w:b/>
-          <w:bCs/>
-          <w:color w:val="D86DCB" w:themeColor="accent5" w:themeTint="99"/>
-          <w:sz w:val="32"/>
-          <w:szCs w:val="32"/>
-        </w:rPr>
-        <w:t xml:space="preserve">   </w:t>
-      </w:r>
-      <w:r>
-        <w:rPr>
-          <w:b/>
-          <w:bCs/>
-          <w:color w:val="D86DCB" w:themeColor="accent5" w:themeTint="99"/>
-          <w:sz w:val="32"/>
-          <w:szCs w:val="32"/>
-        </w:rPr>
-        <w:t xml:space="preserve"> </w:t>
-      </w:r>
-      <w:r>
-        <w:rPr>
-          <w:b/>
-          <w:bCs/>
-          <w:color w:val="D86DCB" w:themeColor="accent5" w:themeTint="99"/>
-          <w:sz w:val="32"/>
-          <w:szCs w:val="32"/>
-        </w:rPr>
-        <w:t xml:space="preserve">  ],</w:t>
-      </w:r>
-    </w:p>
-    <w:p>
-      <w:pPr>
-        <w:jc w:val="both"/>
-        <w:rPr>
-          <w:b/>
-          <w:bCs/>
-          <w:color w:val="D86DCB" w:themeColor="accent5" w:themeTint="99"/>
-          <w:sz w:val="32"/>
-          <w:szCs w:val="32"/>
-        </w:rPr>
-      </w:pPr>
-      <w:r>
-        <w:rPr>
-          <w:b/>
-          <w:bCs/>
-          <w:color w:val="D86DCB" w:themeColor="accent5" w:themeTint="99"/>
-          <w:sz w:val="32"/>
-          <w:szCs w:val="32"/>
-        </w:rPr>
-        <w:t xml:space="preserve"> </w:t>
-      </w:r>
-      <w:r>
-        <w:rPr>
-          <w:b/>
-          <w:bCs/>
-          <w:color w:val="D86DCB" w:themeColor="accent5" w:themeTint="99"/>
-          <w:sz w:val="32"/>
-          <w:szCs w:val="32"/>
-        </w:rPr>
-        <w:t xml:space="preserve">  );</w:t>
-      </w:r>
-    </w:p>
-    <w:p>
-      <w:pPr>
-        <w:jc w:val="both"/>
-        <w:rPr>
-          <w:b/>
-          <w:bCs/>
-          <w:color w:val="D86DCB" w:themeColor="accent5" w:themeTint="99"/>
-          <w:sz w:val="32"/>
-          <w:szCs w:val="32"/>
-        </w:rPr>
-      </w:pPr>
-      <w:r>
-        <w:rPr>
-          <w:b/>
-          <w:bCs/>
+          <w:color w:val="D86DCB" w:themeColor="accent5" w:themeTint="99"/>
+          <w:sz w:val="32"/>
+          <w:szCs w:val="32"/>
+        </w:rPr>
+      </w:pPr>
+      <w:r>
+        <w:rPr>
+          <w:color w:val="D86DCB" w:themeColor="accent5" w:themeTint="99"/>
+          <w:sz w:val="32"/>
+          <w:szCs w:val="32"/>
+        </w:rPr>
+        <w:t xml:space="preserve">          ),</w:t>
+      </w:r>
+    </w:p>
+    <w:p>
+      <w:pPr>
+        <w:jc w:val="both"/>
+        <w:rPr>
+          <w:color w:val="D86DCB" w:themeColor="accent5" w:themeTint="99"/>
+          <w:sz w:val="32"/>
+          <w:szCs w:val="32"/>
+        </w:rPr>
+      </w:pPr>
+      <w:r>
+        <w:rPr>
+          <w:color w:val="D86DCB" w:themeColor="accent5" w:themeTint="99"/>
+          <w:sz w:val="32"/>
+          <w:szCs w:val="32"/>
+        </w:rPr>
+        <w:t xml:space="preserve">      ],</w:t>
+      </w:r>
+    </w:p>
+    <w:p>
+      <w:pPr>
+        <w:jc w:val="both"/>
+        <w:rPr>
+          <w:color w:val="D86DCB" w:themeColor="accent5" w:themeTint="99"/>
+          <w:sz w:val="32"/>
+          <w:szCs w:val="32"/>
+        </w:rPr>
+      </w:pPr>
+      <w:r>
+        <w:rPr>
+          <w:color w:val="D86DCB" w:themeColor="accent5" w:themeTint="99"/>
+          <w:sz w:val="32"/>
+          <w:szCs w:val="32"/>
+        </w:rPr>
+        <w:t xml:space="preserve">   );</w:t>
+      </w:r>
+    </w:p>
+    <w:p>
+      <w:pPr>
+        <w:jc w:val="both"/>
+        <w:rPr>
+          <w:color w:val="D86DCB" w:themeColor="accent5" w:themeTint="99"/>
+          <w:sz w:val="32"/>
+          <w:szCs w:val="32"/>
+        </w:rPr>
+      </w:pPr>
+      <w:r>
+        <w:rPr>
           <w:color w:val="D86DCB" w:themeColor="accent5" w:themeTint="99"/>
           <w:sz w:val="32"/>
           <w:szCs w:val="32"/>
@@ -4350,29 +3013,23 @@
       <w:pPr>
         <w:jc w:val="both"/>
         <w:rPr>
-          <w:b/>
-          <w:bCs/>
-          <w:color w:val="D86DCB" w:themeColor="accent5" w:themeTint="99"/>
-          <w:sz w:val="32"/>
-          <w:szCs w:val="32"/>
-        </w:rPr>
-      </w:pPr>
-    </w:p>
-    <w:p>
-      <w:pPr>
-        <w:jc w:val="both"/>
-        <w:rPr>
-          <w:b/>
-          <w:bCs/>
-          <w:color w:val="D86DCB" w:themeColor="accent5" w:themeTint="99"/>
-          <w:sz w:val="32"/>
-          <w:szCs w:val="32"/>
-        </w:rPr>
-      </w:pPr>
-      <w:r>
-        <w:rPr>
-          <w:b/>
-          <w:bCs/>
+          <w:color w:val="D86DCB" w:themeColor="accent5" w:themeTint="99"/>
+          <w:sz w:val="32"/>
+          <w:szCs w:val="32"/>
+        </w:rPr>
+      </w:pPr>
+    </w:p>
+    <w:p>
+      <w:pPr>
+        <w:jc w:val="both"/>
+        <w:rPr>
+          <w:color w:val="D86DCB" w:themeColor="accent5" w:themeTint="99"/>
+          <w:sz w:val="32"/>
+          <w:szCs w:val="32"/>
+        </w:rPr>
+      </w:pPr>
+      <w:r>
+        <w:rPr>
           <w:color w:val="D86DCB" w:themeColor="accent5" w:themeTint="99"/>
           <w:sz w:val="32"/>
           <w:szCs w:val="32"/>
@@ -4382,8 +3039,6 @@
       <w:proofErr w:type="spellStart"/>
       <w:r>
         <w:rPr>
-          <w:b/>
-          <w:bCs/>
           <w:color w:val="D86DCB" w:themeColor="accent5" w:themeTint="99"/>
           <w:sz w:val="32"/>
           <w:szCs w:val="32"/>
@@ -4393,8 +3048,6 @@
       <w:proofErr w:type="spellEnd"/>
       <w:r>
         <w:rPr>
-          <w:b/>
-          <w:bCs/>
           <w:color w:val="D86DCB" w:themeColor="accent5" w:themeTint="99"/>
           <w:sz w:val="32"/>
           <w:szCs w:val="32"/>
@@ -4404,29 +3057,15 @@
       <w:proofErr w:type="spellStart"/>
       <w:r>
         <w:rPr>
-          <w:b/>
-          <w:bCs/>
-          <w:color w:val="D86DCB" w:themeColor="accent5" w:themeTint="99"/>
-          <w:sz w:val="32"/>
-          <w:szCs w:val="32"/>
-        </w:rPr>
-        <w:t>Consumer</w:t>
-      </w:r>
-      <w:r>
-        <w:rPr>
-          <w:b/>
-          <w:bCs/>
-          <w:color w:val="D86DCB" w:themeColor="accent5" w:themeTint="99"/>
-          <w:sz w:val="32"/>
-          <w:szCs w:val="32"/>
-        </w:rPr>
-        <w:t>Widget</w:t>
-      </w:r>
-      <w:proofErr w:type="spellEnd"/>
-      <w:r>
-        <w:rPr>
-          <w:b/>
-          <w:bCs/>
+          <w:color w:val="D86DCB" w:themeColor="accent5" w:themeTint="99"/>
+          <w:sz w:val="32"/>
+          <w:szCs w:val="32"/>
+        </w:rPr>
+        <w:t>ConsumerWidget</w:t>
+      </w:r>
+      <w:proofErr w:type="spellEnd"/>
+      <w:r>
+        <w:rPr>
           <w:color w:val="D86DCB" w:themeColor="accent5" w:themeTint="99"/>
           <w:sz w:val="32"/>
           <w:szCs w:val="32"/>
@@ -4438,17 +3077,13 @@
       <w:pPr>
         <w:jc w:val="both"/>
         <w:rPr>
-          <w:b/>
-          <w:bCs/>
-          <w:color w:val="D86DCB" w:themeColor="accent5" w:themeTint="99"/>
-          <w:sz w:val="32"/>
-          <w:szCs w:val="32"/>
-        </w:rPr>
-      </w:pPr>
-      <w:r>
-        <w:rPr>
-          <w:b/>
-          <w:bCs/>
+          <w:color w:val="D86DCB" w:themeColor="accent5" w:themeTint="99"/>
+          <w:sz w:val="32"/>
+          <w:szCs w:val="32"/>
+        </w:rPr>
+      </w:pPr>
+      <w:r>
+        <w:rPr>
           <w:color w:val="D86DCB" w:themeColor="accent5" w:themeTint="99"/>
           <w:sz w:val="32"/>
           <w:szCs w:val="32"/>
@@ -4458,8 +3093,6 @@
       <w:proofErr w:type="spellStart"/>
       <w:r>
         <w:rPr>
-          <w:b/>
-          <w:bCs/>
           <w:color w:val="D86DCB" w:themeColor="accent5" w:themeTint="99"/>
           <w:sz w:val="32"/>
           <w:szCs w:val="32"/>
@@ -4469,8 +3102,6 @@
       <w:proofErr w:type="spellEnd"/>
       <w:r>
         <w:rPr>
-          <w:b/>
-          <w:bCs/>
           <w:color w:val="D86DCB" w:themeColor="accent5" w:themeTint="99"/>
           <w:sz w:val="32"/>
           <w:szCs w:val="32"/>
@@ -4480,8 +3111,6 @@
       <w:proofErr w:type="spellStart"/>
       <w:r>
         <w:rPr>
-          <w:b/>
-          <w:bCs/>
           <w:color w:val="D86DCB" w:themeColor="accent5" w:themeTint="99"/>
           <w:sz w:val="32"/>
           <w:szCs w:val="32"/>
@@ -4491,8 +3120,6 @@
       <w:proofErr w:type="spellEnd"/>
       <w:r>
         <w:rPr>
-          <w:b/>
-          <w:bCs/>
           <w:color w:val="D86DCB" w:themeColor="accent5" w:themeTint="99"/>
           <w:sz w:val="32"/>
           <w:szCs w:val="32"/>
@@ -4504,29 +3131,23 @@
       <w:pPr>
         <w:jc w:val="both"/>
         <w:rPr>
-          <w:b/>
-          <w:bCs/>
-          <w:color w:val="D86DCB" w:themeColor="accent5" w:themeTint="99"/>
-          <w:sz w:val="32"/>
-          <w:szCs w:val="32"/>
-        </w:rPr>
-      </w:pPr>
-    </w:p>
-    <w:p>
-      <w:pPr>
-        <w:jc w:val="both"/>
-        <w:rPr>
-          <w:b/>
-          <w:bCs/>
-          <w:color w:val="D86DCB" w:themeColor="accent5" w:themeTint="99"/>
-          <w:sz w:val="32"/>
-          <w:szCs w:val="32"/>
-        </w:rPr>
-      </w:pPr>
-      <w:r>
-        <w:rPr>
-          <w:b/>
-          <w:bCs/>
+          <w:color w:val="D86DCB" w:themeColor="accent5" w:themeTint="99"/>
+          <w:sz w:val="32"/>
+          <w:szCs w:val="32"/>
+        </w:rPr>
+      </w:pPr>
+    </w:p>
+    <w:p>
+      <w:pPr>
+        <w:jc w:val="both"/>
+        <w:rPr>
+          <w:color w:val="D86DCB" w:themeColor="accent5" w:themeTint="99"/>
+          <w:sz w:val="32"/>
+          <w:szCs w:val="32"/>
+        </w:rPr>
+      </w:pPr>
+      <w:r>
+        <w:rPr>
           <w:color w:val="D86DCB" w:themeColor="accent5" w:themeTint="99"/>
           <w:sz w:val="32"/>
           <w:szCs w:val="32"/>
@@ -4539,17 +3160,13 @@
       <w:pPr>
         <w:jc w:val="both"/>
         <w:rPr>
-          <w:b/>
-          <w:bCs/>
-          <w:color w:val="D86DCB" w:themeColor="accent5" w:themeTint="99"/>
-          <w:sz w:val="32"/>
-          <w:szCs w:val="32"/>
-        </w:rPr>
-      </w:pPr>
-      <w:r>
-        <w:rPr>
-          <w:b/>
-          <w:bCs/>
+          <w:color w:val="D86DCB" w:themeColor="accent5" w:themeTint="99"/>
+          <w:sz w:val="32"/>
+          <w:szCs w:val="32"/>
+        </w:rPr>
+      </w:pPr>
+      <w:r>
+        <w:rPr>
           <w:color w:val="D86DCB" w:themeColor="accent5" w:themeTint="99"/>
           <w:sz w:val="32"/>
           <w:szCs w:val="32"/>
@@ -4559,8 +3176,6 @@
       <w:proofErr w:type="gramStart"/>
       <w:r>
         <w:rPr>
-          <w:b/>
-          <w:bCs/>
           <w:color w:val="D86DCB" w:themeColor="accent5" w:themeTint="99"/>
           <w:sz w:val="32"/>
           <w:szCs w:val="32"/>
@@ -4571,8 +3186,6 @@
       <w:proofErr w:type="gramEnd"/>
       <w:r>
         <w:rPr>
-          <w:b/>
-          <w:bCs/>
           <w:color w:val="D86DCB" w:themeColor="accent5" w:themeTint="99"/>
           <w:sz w:val="32"/>
           <w:szCs w:val="32"/>
@@ -4582,29 +3195,15 @@
       <w:proofErr w:type="spellEnd"/>
       <w:r>
         <w:rPr>
-          <w:b/>
-          <w:bCs/>
-          <w:color w:val="D86DCB" w:themeColor="accent5" w:themeTint="99"/>
-          <w:sz w:val="32"/>
-          <w:szCs w:val="32"/>
-        </w:rPr>
-        <w:t xml:space="preserve"> context</w:t>
-      </w:r>
-      <w:r>
-        <w:rPr>
-          <w:b/>
-          <w:bCs/>
-          <w:color w:val="D86DCB" w:themeColor="accent5" w:themeTint="99"/>
-          <w:sz w:val="32"/>
-          <w:szCs w:val="32"/>
-        </w:rPr>
-        <w:t xml:space="preserve">, </w:t>
-      </w:r>
-      <w:proofErr w:type="spellStart"/>
-      <w:r>
-        <w:rPr>
-          <w:b/>
-          <w:bCs/>
+          <w:color w:val="D86DCB" w:themeColor="accent5" w:themeTint="99"/>
+          <w:sz w:val="32"/>
+          <w:szCs w:val="32"/>
+        </w:rPr>
+        <w:t xml:space="preserve"> context, </w:t>
+      </w:r>
+      <w:proofErr w:type="spellStart"/>
+      <w:r>
+        <w:rPr>
           <w:color w:val="D86DCB" w:themeColor="accent5" w:themeTint="99"/>
           <w:sz w:val="32"/>
           <w:szCs w:val="32"/>
@@ -4614,62 +3213,34 @@
       <w:proofErr w:type="spellEnd"/>
       <w:r>
         <w:rPr>
-          <w:b/>
-          <w:bCs/>
-          <w:color w:val="D86DCB" w:themeColor="accent5" w:themeTint="99"/>
-          <w:sz w:val="32"/>
-          <w:szCs w:val="32"/>
-        </w:rPr>
-        <w:t xml:space="preserve"> ref</w:t>
-      </w:r>
-      <w:r>
-        <w:rPr>
-          <w:b/>
-          <w:bCs/>
-          <w:color w:val="D86DCB" w:themeColor="accent5" w:themeTint="99"/>
-          <w:sz w:val="32"/>
-          <w:szCs w:val="32"/>
-        </w:rPr>
-        <w:t>) {</w:t>
-      </w:r>
-    </w:p>
-    <w:p>
-      <w:pPr>
-        <w:jc w:val="both"/>
-        <w:rPr>
-          <w:b/>
-          <w:bCs/>
-          <w:color w:val="D86DCB" w:themeColor="accent5" w:themeTint="99"/>
-          <w:sz w:val="32"/>
-          <w:szCs w:val="32"/>
-        </w:rPr>
-      </w:pPr>
-      <w:r>
-        <w:rPr>
-          <w:b/>
-          <w:bCs/>
-          <w:color w:val="D86DCB" w:themeColor="accent5" w:themeTint="99"/>
-          <w:sz w:val="32"/>
-          <w:szCs w:val="32"/>
-        </w:rPr>
-        <w:t xml:space="preserve">    </w:t>
-      </w:r>
-      <w:r>
-        <w:rPr>
-          <w:b/>
-          <w:bCs/>
-          <w:color w:val="D86DCB" w:themeColor="accent5" w:themeTint="99"/>
-          <w:sz w:val="32"/>
-          <w:szCs w:val="32"/>
-        </w:rPr>
-        <w:t xml:space="preserve">final router = </w:t>
+          <w:color w:val="D86DCB" w:themeColor="accent5" w:themeTint="99"/>
+          <w:sz w:val="32"/>
+          <w:szCs w:val="32"/>
+        </w:rPr>
+        <w:t xml:space="preserve"> ref) {</w:t>
+      </w:r>
+    </w:p>
+    <w:p>
+      <w:pPr>
+        <w:jc w:val="both"/>
+        <w:rPr>
+          <w:color w:val="D86DCB" w:themeColor="accent5" w:themeTint="99"/>
+          <w:sz w:val="32"/>
+          <w:szCs w:val="32"/>
+        </w:rPr>
+      </w:pPr>
+      <w:r>
+        <w:rPr>
+          <w:color w:val="D86DCB" w:themeColor="accent5" w:themeTint="99"/>
+          <w:sz w:val="32"/>
+          <w:szCs w:val="32"/>
+        </w:rPr>
+        <w:t xml:space="preserve">    final router = </w:t>
       </w:r>
       <w:proofErr w:type="spellStart"/>
       <w:proofErr w:type="gramStart"/>
       <w:r>
         <w:rPr>
-          <w:b/>
-          <w:bCs/>
           <w:color w:val="D86DCB" w:themeColor="accent5" w:themeTint="99"/>
           <w:sz w:val="32"/>
           <w:szCs w:val="32"/>
@@ -4680,8 +3251,6 @@
       <w:proofErr w:type="gramEnd"/>
       <w:r>
         <w:rPr>
-          <w:b/>
-          <w:bCs/>
           <w:color w:val="D86DCB" w:themeColor="accent5" w:themeTint="99"/>
           <w:sz w:val="32"/>
           <w:szCs w:val="32"/>
@@ -4691,8 +3260,6 @@
       <w:proofErr w:type="spellStart"/>
       <w:r>
         <w:rPr>
-          <w:b/>
-          <w:bCs/>
           <w:color w:val="D86DCB" w:themeColor="accent5" w:themeTint="99"/>
           <w:sz w:val="32"/>
           <w:szCs w:val="32"/>
@@ -4702,8 +3269,6 @@
       <w:proofErr w:type="spellEnd"/>
       <w:r>
         <w:rPr>
-          <w:b/>
-          <w:bCs/>
           <w:color w:val="D86DCB" w:themeColor="accent5" w:themeTint="99"/>
           <w:sz w:val="32"/>
           <w:szCs w:val="32"/>
@@ -4715,17 +3280,13 @@
       <w:pPr>
         <w:jc w:val="both"/>
         <w:rPr>
-          <w:b/>
-          <w:bCs/>
-          <w:color w:val="D86DCB" w:themeColor="accent5" w:themeTint="99"/>
-          <w:sz w:val="32"/>
-          <w:szCs w:val="32"/>
-        </w:rPr>
-      </w:pPr>
-      <w:r>
-        <w:rPr>
-          <w:b/>
-          <w:bCs/>
+          <w:color w:val="D86DCB" w:themeColor="accent5" w:themeTint="99"/>
+          <w:sz w:val="32"/>
+          <w:szCs w:val="32"/>
+        </w:rPr>
+      </w:pPr>
+      <w:r>
+        <w:rPr>
           <w:color w:val="D86DCB" w:themeColor="accent5" w:themeTint="99"/>
           <w:sz w:val="32"/>
           <w:szCs w:val="32"/>
@@ -4735,8 +3296,6 @@
       <w:proofErr w:type="spellStart"/>
       <w:r>
         <w:rPr>
-          <w:b/>
-          <w:bCs/>
           <w:color w:val="D86DCB" w:themeColor="accent5" w:themeTint="99"/>
           <w:sz w:val="32"/>
           <w:szCs w:val="32"/>
@@ -4746,8 +3305,6 @@
       <w:proofErr w:type="spellEnd"/>
       <w:r>
         <w:rPr>
-          <w:b/>
-          <w:bCs/>
           <w:color w:val="D86DCB" w:themeColor="accent5" w:themeTint="99"/>
           <w:sz w:val="32"/>
           <w:szCs w:val="32"/>
@@ -4759,17 +3316,13 @@
       <w:pPr>
         <w:jc w:val="both"/>
         <w:rPr>
-          <w:b/>
-          <w:bCs/>
-          <w:color w:val="D86DCB" w:themeColor="accent5" w:themeTint="99"/>
-          <w:sz w:val="32"/>
-          <w:szCs w:val="32"/>
-        </w:rPr>
-      </w:pPr>
-      <w:r>
-        <w:rPr>
-          <w:b/>
-          <w:bCs/>
+          <w:color w:val="D86DCB" w:themeColor="accent5" w:themeTint="99"/>
+          <w:sz w:val="32"/>
+          <w:szCs w:val="32"/>
+        </w:rPr>
+      </w:pPr>
+      <w:r>
+        <w:rPr>
           <w:color w:val="D86DCB" w:themeColor="accent5" w:themeTint="99"/>
           <w:sz w:val="32"/>
           <w:szCs w:val="32"/>
@@ -4779,8 +3332,6 @@
       <w:proofErr w:type="spellStart"/>
       <w:r>
         <w:rPr>
-          <w:b/>
-          <w:bCs/>
           <w:color w:val="D86DCB" w:themeColor="accent5" w:themeTint="99"/>
           <w:sz w:val="32"/>
           <w:szCs w:val="32"/>
@@ -4790,8 +3341,6 @@
       <w:proofErr w:type="spellEnd"/>
       <w:r>
         <w:rPr>
-          <w:b/>
-          <w:bCs/>
           <w:color w:val="D86DCB" w:themeColor="accent5" w:themeTint="99"/>
           <w:sz w:val="32"/>
           <w:szCs w:val="32"/>
@@ -4803,17 +3352,13 @@
       <w:pPr>
         <w:jc w:val="both"/>
         <w:rPr>
-          <w:b/>
-          <w:bCs/>
-          <w:color w:val="D86DCB" w:themeColor="accent5" w:themeTint="99"/>
-          <w:sz w:val="32"/>
-          <w:szCs w:val="32"/>
-        </w:rPr>
-      </w:pPr>
-      <w:r>
-        <w:rPr>
-          <w:b/>
-          <w:bCs/>
+          <w:color w:val="D86DCB" w:themeColor="accent5" w:themeTint="99"/>
+          <w:sz w:val="32"/>
+          <w:szCs w:val="32"/>
+        </w:rPr>
+      </w:pPr>
+      <w:r>
+        <w:rPr>
           <w:color w:val="D86DCB" w:themeColor="accent5" w:themeTint="99"/>
           <w:sz w:val="32"/>
           <w:szCs w:val="32"/>
@@ -4825,17 +3370,13 @@
       <w:pPr>
         <w:jc w:val="both"/>
         <w:rPr>
-          <w:b/>
-          <w:bCs/>
-          <w:color w:val="D86DCB" w:themeColor="accent5" w:themeTint="99"/>
-          <w:sz w:val="32"/>
-          <w:szCs w:val="32"/>
-        </w:rPr>
-      </w:pPr>
-      <w:r>
-        <w:rPr>
-          <w:b/>
-          <w:bCs/>
+          <w:color w:val="D86DCB" w:themeColor="accent5" w:themeTint="99"/>
+          <w:sz w:val="32"/>
+          <w:szCs w:val="32"/>
+        </w:rPr>
+      </w:pPr>
+      <w:r>
+        <w:rPr>
           <w:color w:val="D86DCB" w:themeColor="accent5" w:themeTint="99"/>
           <w:sz w:val="32"/>
           <w:szCs w:val="32"/>
@@ -4853,8 +3394,6 @@
       </w:pPr>
       <w:r>
         <w:rPr>
-          <w:b/>
-          <w:bCs/>
           <w:color w:val="D86DCB" w:themeColor="accent5" w:themeTint="99"/>
           <w:sz w:val="32"/>
           <w:szCs w:val="32"/>
@@ -6442,6 +4981,7 @@
   <w:style w:type="character" w:default="1" w:styleId="DefaultParagraphFont">
     <w:name w:val="Default Paragraph Font"/>
     <w:uiPriority w:val="1"/>
+    <w:semiHidden/>
     <w:unhideWhenUsed/>
   </w:style>
   <w:style w:type="table" w:default="1" w:styleId="TableNormal">

</xml_diff>